<commit_message>
Backup auto 2025-09-01 20:24:40
</commit_message>
<xml_diff>
--- a/ZZ échanges avec Gemini/250901 10h45 Document d'État du Projet.docx
+++ b/ZZ échanges avec Gemini/250901 10h45 Document d'État du Projet.docx
@@ -708,6 +708,1127 @@
       <w:pPr>
         <w:rPr>
           <w:b/>
+          <w:lang w:val="fr-FR"/>
+        </w:rPr>
+      </w:pPr>
+      <w:r>
+        <w:rPr>
+          <w:b/>
+          <w:lang w:val="fr-FR"/>
+        </w:rPr>
+        <w:t>Absolument. Profitez bien de votre pause déjeuner !</w:t>
+      </w:r>
+    </w:p>
+    <w:p>
+      <w:pPr>
+        <w:rPr>
+          <w:b/>
+          <w:lang w:val="fr-FR"/>
+        </w:rPr>
+      </w:pPr>
+      <w:r>
+        <w:rPr>
+          <w:b/>
+          <w:lang w:val="fr-FR"/>
+        </w:rPr>
+        <w:t>Voici le résumé de notre session de travail de ce matin.</w:t>
+      </w:r>
+    </w:p>
+    <w:p>
+      <w:pPr>
+        <w:rPr>
+          <w:b/>
+          <w:lang w:val="fr-FR"/>
+        </w:rPr>
+      </w:pPr>
+      <w:r>
+        <w:rPr>
+          <w:b/>
+          <w:lang w:val="fr-FR"/>
+        </w:rPr>
+        <w:pict w14:anchorId="73EB249A">
+          <v:rect id="_x0000_i1031" style="width:0;height:1.5pt" o:hralign="center" o:hrstd="t" o:hr="t" fillcolor="#a0a0a0" stroked="f"/>
+        </w:pict>
+      </w:r>
+    </w:p>
+    <w:p>
+      <w:pPr>
+        <w:rPr>
+          <w:b/>
+          <w:bCs/>
+          <w:lang w:val="fr-FR"/>
+        </w:rPr>
+      </w:pPr>
+      <w:r>
+        <w:rPr>
+          <w:b/>
+          <w:bCs/>
+          <w:lang w:val="fr-FR"/>
+        </w:rPr>
+        <w:t>1. En-tête de session</w:t>
+      </w:r>
+    </w:p>
+    <w:p>
+      <w:pPr>
+        <w:numPr>
+          <w:ilvl w:val="0"/>
+          <w:numId w:val="201"/>
+        </w:numPr>
+        <w:rPr>
+          <w:b/>
+          <w:lang w:val="fr-FR"/>
+        </w:rPr>
+      </w:pPr>
+      <w:r>
+        <w:rPr>
+          <w:b/>
+          <w:bCs/>
+          <w:lang w:val="fr-FR"/>
+        </w:rPr>
+        <w:t>Projet</w:t>
+      </w:r>
+      <w:r>
+        <w:rPr>
+          <w:b/>
+          <w:lang w:val="fr-FR"/>
+        </w:rPr>
+        <w:t xml:space="preserve"> : Usine à Tests</w:t>
+      </w:r>
+    </w:p>
+    <w:p>
+      <w:pPr>
+        <w:numPr>
+          <w:ilvl w:val="0"/>
+          <w:numId w:val="201"/>
+        </w:numPr>
+        <w:rPr>
+          <w:b/>
+          <w:lang w:val="fr-FR"/>
+        </w:rPr>
+      </w:pPr>
+      <w:r>
+        <w:rPr>
+          <w:b/>
+          <w:bCs/>
+          <w:lang w:val="fr-FR"/>
+        </w:rPr>
+        <w:t>Session</w:t>
+      </w:r>
+      <w:r>
+        <w:rPr>
+          <w:b/>
+          <w:lang w:val="fr-FR"/>
+        </w:rPr>
+        <w:t xml:space="preserve"> : 2025-09-01 — S12 (Équilibrage Test 'Couleurs' &amp; Fiabilisation BDD)</w:t>
+      </w:r>
+    </w:p>
+    <w:p>
+      <w:pPr>
+        <w:numPr>
+          <w:ilvl w:val="0"/>
+          <w:numId w:val="201"/>
+        </w:numPr>
+        <w:rPr>
+          <w:b/>
+          <w:lang w:val="fr-FR"/>
+        </w:rPr>
+      </w:pPr>
+      <w:r>
+        <w:rPr>
+          <w:b/>
+          <w:bCs/>
+          <w:lang w:val="fr-FR"/>
+        </w:rPr>
+        <w:t>Auteur</w:t>
+      </w:r>
+      <w:r>
+        <w:rPr>
+          <w:b/>
+          <w:lang w:val="fr-FR"/>
+        </w:rPr>
+        <w:t xml:space="preserve"> : Assistant Technique</w:t>
+      </w:r>
+    </w:p>
+    <w:p>
+      <w:pPr>
+        <w:numPr>
+          <w:ilvl w:val="0"/>
+          <w:numId w:val="201"/>
+        </w:numPr>
+        <w:rPr>
+          <w:b/>
+          <w:lang w:val="fr-FR"/>
+        </w:rPr>
+      </w:pPr>
+      <w:r>
+        <w:rPr>
+          <w:b/>
+          <w:bCs/>
+          <w:lang w:val="fr-FR"/>
+        </w:rPr>
+        <w:t>Versions des scripts</w:t>
+      </w:r>
+      <w:r>
+        <w:rPr>
+          <w:b/>
+          <w:lang w:val="fr-FR"/>
+        </w:rPr>
+        <w:t xml:space="preserve"> : Aucune modification de script. Les mises à jour ont uniquement eu lieu dans la base de données [BDD]V2.</w:t>
+      </w:r>
+    </w:p>
+    <w:p>
+      <w:pPr>
+        <w:rPr>
+          <w:b/>
+          <w:bCs/>
+          <w:lang w:val="fr-FR"/>
+        </w:rPr>
+      </w:pPr>
+      <w:r>
+        <w:rPr>
+          <w:b/>
+          <w:bCs/>
+          <w:lang w:val="fr-FR"/>
+        </w:rPr>
+        <w:t>2. Ce qui a été fait aujourd’hui (delta)</w:t>
+      </w:r>
+    </w:p>
+    <w:p>
+      <w:pPr>
+        <w:numPr>
+          <w:ilvl w:val="0"/>
+          <w:numId w:val="202"/>
+        </w:numPr>
+        <w:rPr>
+          <w:b/>
+          <w:lang w:val="fr-FR"/>
+        </w:rPr>
+      </w:pPr>
+      <w:r>
+        <w:rPr>
+          <w:b/>
+          <w:bCs/>
+          <w:lang w:val="fr-FR"/>
+        </w:rPr>
+        <w:t>Refonte Complète du Questionnaire "Couleurs"</w:t>
+      </w:r>
+    </w:p>
+    <w:p>
+      <w:pPr>
+        <w:numPr>
+          <w:ilvl w:val="1"/>
+          <w:numId w:val="202"/>
+        </w:numPr>
+        <w:rPr>
+          <w:b/>
+          <w:lang w:val="fr-FR"/>
+        </w:rPr>
+      </w:pPr>
+      <w:r>
+        <w:rPr>
+          <w:b/>
+          <w:bCs/>
+          <w:lang w:val="fr-FR"/>
+        </w:rPr>
+        <w:t>Analyse</w:t>
+      </w:r>
+      <w:r>
+        <w:rPr>
+          <w:b/>
+          <w:lang w:val="fr-FR"/>
+        </w:rPr>
+        <w:t xml:space="preserve"> : Nous avons confirmé un déséquilibre majeur dans le questionnaire initial de 40 questions, où le profil Rouge (Compétiteur) était nettement sous-représenté (score max de 13 points contre 23 pour le Jaune).</w:t>
+      </w:r>
+    </w:p>
+    <w:p>
+      <w:pPr>
+        <w:numPr>
+          <w:ilvl w:val="1"/>
+          <w:numId w:val="202"/>
+        </w:numPr>
+        <w:rPr>
+          <w:b/>
+          <w:lang w:val="fr-FR"/>
+        </w:rPr>
+      </w:pPr>
+      <w:r>
+        <w:rPr>
+          <w:b/>
+          <w:bCs/>
+          <w:lang w:val="fr-FR"/>
+        </w:rPr>
+        <w:t>Modification</w:t>
+      </w:r>
+      <w:r>
+        <w:rPr>
+          <w:b/>
+          <w:lang w:val="fr-FR"/>
+        </w:rPr>
+        <w:t xml:space="preserve"> : Un nouveau questionnaire de 40 questions a été entièrement recréé. Il est structuré en 5 blocs de 8 questions, garantissant que chaque profil (Rouge, Vert, Bleu, Jaune) est proposé </w:t>
+      </w:r>
+      <w:r>
+        <w:rPr>
+          <w:b/>
+          <w:bCs/>
+          <w:lang w:val="fr-FR"/>
+        </w:rPr>
+        <w:t>exactement 20 fois</w:t>
+      </w:r>
+      <w:r>
+        <w:rPr>
+          <w:b/>
+          <w:lang w:val="fr-FR"/>
+        </w:rPr>
+        <w:t>.</w:t>
+      </w:r>
+    </w:p>
+    <w:p>
+      <w:pPr>
+        <w:numPr>
+          <w:ilvl w:val="1"/>
+          <w:numId w:val="202"/>
+        </w:numPr>
+        <w:rPr>
+          <w:b/>
+          <w:lang w:val="fr-FR"/>
+        </w:rPr>
+      </w:pPr>
+      <w:r>
+        <w:rPr>
+          <w:b/>
+          <w:bCs/>
+          <w:lang w:val="fr-FR"/>
+        </w:rPr>
+        <w:t>Déploiement</w:t>
+      </w:r>
+      <w:r>
+        <w:rPr>
+          <w:b/>
+          <w:lang w:val="fr-FR"/>
+        </w:rPr>
+        <w:t xml:space="preserve"> : Les versions française (</w:t>
+      </w:r>
+      <w:proofErr w:type="spellStart"/>
+      <w:r>
+        <w:rPr>
+          <w:b/>
+          <w:lang w:val="fr-FR"/>
+        </w:rPr>
+        <w:t>Questions_Couleurs_FR</w:t>
+      </w:r>
+      <w:proofErr w:type="spellEnd"/>
+      <w:r>
+        <w:rPr>
+          <w:b/>
+          <w:lang w:val="fr-FR"/>
+        </w:rPr>
+        <w:t>) et anglaise (</w:t>
+      </w:r>
+      <w:proofErr w:type="spellStart"/>
+      <w:r>
+        <w:rPr>
+          <w:b/>
+          <w:lang w:val="fr-FR"/>
+        </w:rPr>
+        <w:t>Questions_Couleurs_EN</w:t>
+      </w:r>
+      <w:proofErr w:type="spellEnd"/>
+      <w:r>
+        <w:rPr>
+          <w:b/>
+          <w:lang w:val="fr-FR"/>
+        </w:rPr>
+        <w:t>) de ce nouveau questionnaire équilibré ont été produites et intégrées dans la base de données.</w:t>
+      </w:r>
+    </w:p>
+    <w:p>
+      <w:pPr>
+        <w:numPr>
+          <w:ilvl w:val="1"/>
+          <w:numId w:val="202"/>
+        </w:numPr>
+        <w:rPr>
+          <w:b/>
+          <w:lang w:val="fr-FR"/>
+        </w:rPr>
+      </w:pPr>
+      <w:r>
+        <w:rPr>
+          <w:b/>
+          <w:bCs/>
+          <w:lang w:val="fr-FR"/>
+        </w:rPr>
+        <w:t>Impact</w:t>
+      </w:r>
+      <w:r>
+        <w:rPr>
+          <w:b/>
+          <w:lang w:val="fr-FR"/>
+        </w:rPr>
+        <w:t xml:space="preserve"> : Critique. Le test "Couleurs" est maintenant statistiquement juste, fiable, et le score maximum possible est de </w:t>
+      </w:r>
+      <w:r>
+        <w:rPr>
+          <w:b/>
+          <w:bCs/>
+          <w:lang w:val="fr-FR"/>
+        </w:rPr>
+        <w:t>20 points</w:t>
+      </w:r>
+      <w:r>
+        <w:rPr>
+          <w:b/>
+          <w:lang w:val="fr-FR"/>
+        </w:rPr>
+        <w:t xml:space="preserve"> pour chaque profil.</w:t>
+      </w:r>
+    </w:p>
+    <w:p>
+      <w:pPr>
+        <w:numPr>
+          <w:ilvl w:val="0"/>
+          <w:numId w:val="202"/>
+        </w:numPr>
+        <w:rPr>
+          <w:b/>
+          <w:lang w:val="fr-FR"/>
+        </w:rPr>
+      </w:pPr>
+      <w:r>
+        <w:rPr>
+          <w:b/>
+          <w:bCs/>
+          <w:lang w:val="fr-FR"/>
+        </w:rPr>
+        <w:t>Diagnostic et Fiabilisation de la Base de Données</w:t>
+      </w:r>
+    </w:p>
+    <w:p>
+      <w:pPr>
+        <w:numPr>
+          <w:ilvl w:val="1"/>
+          <w:numId w:val="202"/>
+        </w:numPr>
+        <w:rPr>
+          <w:b/>
+          <w:lang w:val="fr-FR"/>
+        </w:rPr>
+      </w:pPr>
+      <w:r>
+        <w:rPr>
+          <w:b/>
+          <w:bCs/>
+          <w:lang w:val="fr-FR"/>
+        </w:rPr>
+        <w:t>Problème Identifié</w:t>
+      </w:r>
+      <w:r>
+        <w:rPr>
+          <w:b/>
+          <w:lang w:val="fr-FR"/>
+        </w:rPr>
+        <w:t xml:space="preserve"> : Les </w:t>
+      </w:r>
+      <w:proofErr w:type="gramStart"/>
+      <w:r>
+        <w:rPr>
+          <w:b/>
+          <w:lang w:val="fr-FR"/>
+        </w:rPr>
+        <w:t>e-mails</w:t>
+      </w:r>
+      <w:proofErr w:type="gramEnd"/>
+      <w:r>
+        <w:rPr>
+          <w:b/>
+          <w:lang w:val="fr-FR"/>
+        </w:rPr>
+        <w:t xml:space="preserve"> de résultats en anglais arrivaient tronqués car le script lisait un ancien onglet de questions obsolète (</w:t>
+      </w:r>
+      <w:proofErr w:type="spellStart"/>
+      <w:r>
+        <w:rPr>
+          <w:b/>
+          <w:lang w:val="fr-FR"/>
+        </w:rPr>
+        <w:t>ex_Questions_Couleurs_EN</w:t>
+      </w:r>
+      <w:proofErr w:type="spellEnd"/>
+      <w:r>
+        <w:rPr>
+          <w:b/>
+          <w:lang w:val="fr-FR"/>
+        </w:rPr>
+        <w:t>) qui persistait dans la BDD.</w:t>
+      </w:r>
+    </w:p>
+    <w:p>
+      <w:pPr>
+        <w:numPr>
+          <w:ilvl w:val="1"/>
+          <w:numId w:val="202"/>
+        </w:numPr>
+        <w:rPr>
+          <w:b/>
+          <w:lang w:val="fr-FR"/>
+        </w:rPr>
+      </w:pPr>
+      <w:r>
+        <w:rPr>
+          <w:b/>
+          <w:bCs/>
+          <w:lang w:val="fr-FR"/>
+        </w:rPr>
+        <w:t>Solution Apportée</w:t>
+      </w:r>
+      <w:r>
+        <w:rPr>
+          <w:b/>
+          <w:lang w:val="fr-FR"/>
+        </w:rPr>
+        <w:t xml:space="preserve"> : L'ancien onglet a été supprimé, levant toute ambiguïté pour le script de traitement.</w:t>
+      </w:r>
+    </w:p>
+    <w:p>
+      <w:pPr>
+        <w:numPr>
+          <w:ilvl w:val="1"/>
+          <w:numId w:val="202"/>
+        </w:numPr>
+        <w:rPr>
+          <w:b/>
+          <w:lang w:val="fr-FR"/>
+        </w:rPr>
+      </w:pPr>
+      <w:r>
+        <w:rPr>
+          <w:b/>
+          <w:bCs/>
+          <w:lang w:val="fr-FR"/>
+        </w:rPr>
+        <w:lastRenderedPageBreak/>
+        <w:t>Impact</w:t>
+      </w:r>
+      <w:r>
+        <w:rPr>
+          <w:b/>
+          <w:lang w:val="fr-FR"/>
+        </w:rPr>
+        <w:t xml:space="preserve"> : Élevé. Cette action a non seulement corrigé le bug, mais a aussi renforcé la nécessité de maintenir une BDD "propre", sans fichiers ou onglets obsolètes qui pourraient perturber les automatisations.</w:t>
+      </w:r>
+    </w:p>
+    <w:p>
+      <w:pPr>
+        <w:rPr>
+          <w:b/>
+          <w:bCs/>
+          <w:lang w:val="fr-FR"/>
+        </w:rPr>
+      </w:pPr>
+      <w:r>
+        <w:rPr>
+          <w:b/>
+          <w:bCs/>
+          <w:lang w:val="fr-FR"/>
+        </w:rPr>
+        <w:t>3. Décisions prises &amp; raisons</w:t>
+      </w:r>
+    </w:p>
+    <w:p>
+      <w:pPr>
+        <w:numPr>
+          <w:ilvl w:val="0"/>
+          <w:numId w:val="203"/>
+        </w:numPr>
+        <w:rPr>
+          <w:b/>
+          <w:lang w:val="fr-FR"/>
+        </w:rPr>
+      </w:pPr>
+      <w:r>
+        <w:rPr>
+          <w:b/>
+          <w:bCs/>
+          <w:lang w:val="fr-FR"/>
+        </w:rPr>
+        <w:t>Adoption d'une structure équilibrée par blocs</w:t>
+      </w:r>
+      <w:r>
+        <w:rPr>
+          <w:b/>
+          <w:lang w:val="fr-FR"/>
+        </w:rPr>
+        <w:t xml:space="preserve"> : Il a été acté que les questionnaires dichotomiques doivent être construits sur une structure garantissant un nombre d'occurrences égal pour chaque profil.</w:t>
+      </w:r>
+    </w:p>
+    <w:p>
+      <w:pPr>
+        <w:numPr>
+          <w:ilvl w:val="0"/>
+          <w:numId w:val="203"/>
+        </w:numPr>
+        <w:rPr>
+          <w:b/>
+          <w:lang w:val="fr-FR"/>
+        </w:rPr>
+      </w:pPr>
+      <w:r>
+        <w:rPr>
+          <w:b/>
+          <w:bCs/>
+          <w:lang w:val="fr-FR"/>
+        </w:rPr>
+        <w:t>Nettoyage des onglets obsolètes</w:t>
+      </w:r>
+      <w:r>
+        <w:rPr>
+          <w:b/>
+          <w:lang w:val="fr-FR"/>
+        </w:rPr>
+        <w:t xml:space="preserve"> : Il a été confirmé que le simple renommage (ex: avec un préfixe "ex_") n'est pas une pratique sûre. Les onglets obsolètes doivent être </w:t>
+      </w:r>
+      <w:r>
+        <w:rPr>
+          <w:b/>
+          <w:bCs/>
+          <w:lang w:val="fr-FR"/>
+        </w:rPr>
+        <w:t>complètement supprimés</w:t>
+      </w:r>
+      <w:r>
+        <w:rPr>
+          <w:b/>
+          <w:lang w:val="fr-FR"/>
+        </w:rPr>
+        <w:t xml:space="preserve"> de la BDD pour garantir que les scripts ne les lisent pas par erreur.</w:t>
+      </w:r>
+    </w:p>
+    <w:p>
+      <w:pPr>
+        <w:rPr>
+          <w:b/>
+          <w:bCs/>
+          <w:lang w:val="fr-FR"/>
+        </w:rPr>
+      </w:pPr>
+      <w:r>
+        <w:rPr>
+          <w:b/>
+          <w:bCs/>
+          <w:lang w:val="fr-FR"/>
+        </w:rPr>
+        <w:t>4. État actuel du système</w:t>
+      </w:r>
+    </w:p>
+    <w:p>
+      <w:pPr>
+        <w:numPr>
+          <w:ilvl w:val="0"/>
+          <w:numId w:val="204"/>
+        </w:numPr>
+        <w:rPr>
+          <w:b/>
+          <w:lang w:val="fr-FR"/>
+        </w:rPr>
+      </w:pPr>
+      <w:r>
+        <w:rPr>
+          <w:b/>
+          <w:bCs/>
+          <w:lang w:val="fr-FR"/>
+        </w:rPr>
+        <w:t>Test 'Couleurs'</w:t>
+      </w:r>
+      <w:r>
+        <w:rPr>
+          <w:b/>
+          <w:lang w:val="fr-FR"/>
+        </w:rPr>
+        <w:t xml:space="preserve"> : </w:t>
+      </w:r>
+      <w:r>
+        <w:rPr>
+          <w:rFonts w:ascii="Segoe UI Emoji" w:hAnsi="Segoe UI Emoji" w:cs="Segoe UI Emoji"/>
+          <w:b/>
+          <w:lang w:val="fr-FR"/>
+        </w:rPr>
+        <w:t>✅</w:t>
+      </w:r>
+      <w:r>
+        <w:rPr>
+          <w:b/>
+          <w:lang w:val="fr-FR"/>
+        </w:rPr>
+        <w:t xml:space="preserve"> Fonctionnel, </w:t>
+      </w:r>
+      <w:r>
+        <w:rPr>
+          <w:rFonts w:ascii="Aptos" w:hAnsi="Aptos" w:cs="Aptos"/>
+          <w:b/>
+          <w:lang w:val="fr-FR"/>
+        </w:rPr>
+        <w:t>é</w:t>
+      </w:r>
+      <w:r>
+        <w:rPr>
+          <w:b/>
+          <w:lang w:val="fr-FR"/>
+        </w:rPr>
+        <w:t>quilibr</w:t>
+      </w:r>
+      <w:r>
+        <w:rPr>
+          <w:rFonts w:ascii="Aptos" w:hAnsi="Aptos" w:cs="Aptos"/>
+          <w:b/>
+          <w:lang w:val="fr-FR"/>
+        </w:rPr>
+        <w:t>é</w:t>
+      </w:r>
+      <w:r>
+        <w:rPr>
+          <w:b/>
+          <w:lang w:val="fr-FR"/>
+        </w:rPr>
+        <w:t xml:space="preserve"> et bilingue (FR/EN).</w:t>
+      </w:r>
+    </w:p>
+    <w:p>
+      <w:pPr>
+        <w:numPr>
+          <w:ilvl w:val="0"/>
+          <w:numId w:val="204"/>
+        </w:numPr>
+        <w:rPr>
+          <w:b/>
+          <w:lang w:val="fr-FR"/>
+        </w:rPr>
+      </w:pPr>
+      <w:r>
+        <w:rPr>
+          <w:b/>
+          <w:bCs/>
+          <w:lang w:val="fr-FR"/>
+        </w:rPr>
+        <w:t>Moteurs (Calcul &amp; Génération)</w:t>
+      </w:r>
+      <w:r>
+        <w:rPr>
+          <w:b/>
+          <w:lang w:val="fr-FR"/>
+        </w:rPr>
+        <w:t xml:space="preserve"> : </w:t>
+      </w:r>
+      <w:r>
+        <w:rPr>
+          <w:rFonts w:ascii="Segoe UI Emoji" w:hAnsi="Segoe UI Emoji" w:cs="Segoe UI Emoji"/>
+          <w:b/>
+          <w:lang w:val="fr-FR"/>
+        </w:rPr>
+        <w:t>✅</w:t>
+      </w:r>
+      <w:r>
+        <w:rPr>
+          <w:b/>
+          <w:lang w:val="fr-FR"/>
+        </w:rPr>
+        <w:t xml:space="preserve"> Stables.</w:t>
+      </w:r>
+    </w:p>
+    <w:p>
+      <w:pPr>
+        <w:numPr>
+          <w:ilvl w:val="0"/>
+          <w:numId w:val="204"/>
+        </w:numPr>
+        <w:rPr>
+          <w:b/>
+          <w:lang w:val="fr-FR"/>
+        </w:rPr>
+      </w:pPr>
+      <w:r>
+        <w:rPr>
+          <w:b/>
+          <w:bCs/>
+          <w:lang w:val="fr-FR"/>
+        </w:rPr>
+        <w:t>Base de Données (BDD)</w:t>
+      </w:r>
+      <w:r>
+        <w:rPr>
+          <w:b/>
+          <w:lang w:val="fr-FR"/>
+        </w:rPr>
+        <w:t xml:space="preserve"> : </w:t>
+      </w:r>
+      <w:r>
+        <w:rPr>
+          <w:rFonts w:ascii="Segoe UI Emoji" w:hAnsi="Segoe UI Emoji" w:cs="Segoe UI Emoji"/>
+          <w:b/>
+          <w:lang w:val="fr-FR"/>
+        </w:rPr>
+        <w:t>✅</w:t>
+      </w:r>
+      <w:r>
+        <w:rPr>
+          <w:b/>
+          <w:lang w:val="fr-FR"/>
+        </w:rPr>
+        <w:t xml:space="preserve"> Fiabilis</w:t>
+      </w:r>
+      <w:r>
+        <w:rPr>
+          <w:rFonts w:ascii="Aptos" w:hAnsi="Aptos" w:cs="Aptos"/>
+          <w:b/>
+          <w:lang w:val="fr-FR"/>
+        </w:rPr>
+        <w:t>é</w:t>
+      </w:r>
+      <w:r>
+        <w:rPr>
+          <w:b/>
+          <w:lang w:val="fr-FR"/>
+        </w:rPr>
+        <w:t>e apr</w:t>
+      </w:r>
+      <w:r>
+        <w:rPr>
+          <w:rFonts w:ascii="Aptos" w:hAnsi="Aptos" w:cs="Aptos"/>
+          <w:b/>
+          <w:lang w:val="fr-FR"/>
+        </w:rPr>
+        <w:t>è</w:t>
+      </w:r>
+      <w:r>
+        <w:rPr>
+          <w:b/>
+          <w:lang w:val="fr-FR"/>
+        </w:rPr>
+        <w:t>s nettoyage.</w:t>
+      </w:r>
+    </w:p>
+    <w:p>
+      <w:pPr>
+        <w:rPr>
+          <w:b/>
+          <w:bCs/>
+          <w:lang w:val="fr-FR"/>
+        </w:rPr>
+      </w:pPr>
+      <w:r>
+        <w:rPr>
+          <w:b/>
+          <w:bCs/>
+          <w:lang w:val="fr-FR"/>
+        </w:rPr>
+        <w:t>5. Vérifications réalisées</w:t>
+      </w:r>
+    </w:p>
+    <w:p>
+      <w:pPr>
+        <w:numPr>
+          <w:ilvl w:val="0"/>
+          <w:numId w:val="205"/>
+        </w:numPr>
+        <w:rPr>
+          <w:b/>
+          <w:lang w:val="fr-FR"/>
+        </w:rPr>
+      </w:pPr>
+      <w:r>
+        <w:rPr>
+          <w:b/>
+          <w:lang w:val="fr-FR"/>
+        </w:rPr>
+        <w:t xml:space="preserve">[ </w:t>
+      </w:r>
+      <w:r>
+        <w:rPr>
+          <w:rFonts w:ascii="Segoe UI Symbol" w:hAnsi="Segoe UI Symbol" w:cs="Segoe UI Symbol"/>
+          <w:b/>
+          <w:lang w:val="fr-FR"/>
+        </w:rPr>
+        <w:t>✔</w:t>
+      </w:r>
+      <w:r>
+        <w:rPr>
+          <w:b/>
+          <w:lang w:val="fr-FR"/>
+        </w:rPr>
+        <w:t xml:space="preserve"> ] Analyse et comptage des scores de l'ancien test 'Couleurs'.</w:t>
+      </w:r>
+    </w:p>
+    <w:p>
+      <w:pPr>
+        <w:numPr>
+          <w:ilvl w:val="0"/>
+          <w:numId w:val="205"/>
+        </w:numPr>
+        <w:rPr>
+          <w:b/>
+          <w:lang w:val="fr-FR"/>
+        </w:rPr>
+      </w:pPr>
+      <w:r>
+        <w:rPr>
+          <w:b/>
+          <w:lang w:val="fr-FR"/>
+        </w:rPr>
+        <w:t xml:space="preserve">[ </w:t>
+      </w:r>
+      <w:r>
+        <w:rPr>
+          <w:rFonts w:ascii="Segoe UI Symbol" w:hAnsi="Segoe UI Symbol" w:cs="Segoe UI Symbol"/>
+          <w:b/>
+          <w:lang w:val="fr-FR"/>
+        </w:rPr>
+        <w:t>✔</w:t>
+      </w:r>
+      <w:r>
+        <w:rPr>
+          <w:b/>
+          <w:lang w:val="fr-FR"/>
+        </w:rPr>
+        <w:t xml:space="preserve"> ] Validation de la nouvelle structure équilibrée du test 'Couleurs'.</w:t>
+      </w:r>
+    </w:p>
+    <w:p>
+      <w:pPr>
+        <w:numPr>
+          <w:ilvl w:val="0"/>
+          <w:numId w:val="205"/>
+        </w:numPr>
+        <w:rPr>
+          <w:b/>
+          <w:lang w:val="fr-FR"/>
+        </w:rPr>
+      </w:pPr>
+      <w:r>
+        <w:rPr>
+          <w:b/>
+          <w:lang w:val="fr-FR"/>
+        </w:rPr>
+        <w:t xml:space="preserve">[ </w:t>
+      </w:r>
+      <w:r>
+        <w:rPr>
+          <w:rFonts w:ascii="Segoe UI Symbol" w:hAnsi="Segoe UI Symbol" w:cs="Segoe UI Symbol"/>
+          <w:b/>
+          <w:lang w:val="fr-FR"/>
+        </w:rPr>
+        <w:t>✔</w:t>
+      </w:r>
+      <w:r>
+        <w:rPr>
+          <w:b/>
+          <w:lang w:val="fr-FR"/>
+        </w:rPr>
+        <w:t xml:space="preserve"> ] Test de génération complet du nouveau test en français et en anglais.</w:t>
+      </w:r>
+    </w:p>
+    <w:p>
+      <w:pPr>
+        <w:numPr>
+          <w:ilvl w:val="0"/>
+          <w:numId w:val="205"/>
+        </w:numPr>
+        <w:rPr>
+          <w:b/>
+          <w:lang w:val="fr-FR"/>
+        </w:rPr>
+      </w:pPr>
+      <w:r>
+        <w:rPr>
+          <w:b/>
+          <w:lang w:val="fr-FR"/>
+        </w:rPr>
+        <w:t xml:space="preserve">[ </w:t>
+      </w:r>
+      <w:r>
+        <w:rPr>
+          <w:rFonts w:ascii="Segoe UI Symbol" w:hAnsi="Segoe UI Symbol" w:cs="Segoe UI Symbol"/>
+          <w:b/>
+          <w:lang w:val="fr-FR"/>
+        </w:rPr>
+        <w:t>✔</w:t>
+      </w:r>
+      <w:r>
+        <w:rPr>
+          <w:b/>
+          <w:lang w:val="fr-FR"/>
+        </w:rPr>
+        <w:t xml:space="preserve"> ] Validation de la réception correcte </w:t>
+      </w:r>
+      <w:proofErr w:type="gramStart"/>
+      <w:r>
+        <w:rPr>
+          <w:b/>
+          <w:lang w:val="fr-FR"/>
+        </w:rPr>
+        <w:t>de l'e-mail</w:t>
+      </w:r>
+      <w:proofErr w:type="gramEnd"/>
+      <w:r>
+        <w:rPr>
+          <w:b/>
+          <w:lang w:val="fr-FR"/>
+        </w:rPr>
+        <w:t xml:space="preserve"> de résultats pour les deux langues.</w:t>
+      </w:r>
+    </w:p>
+    <w:p>
+      <w:pPr>
+        <w:rPr>
+          <w:b/>
+          <w:bCs/>
+          <w:lang w:val="fr-FR"/>
+        </w:rPr>
+      </w:pPr>
+      <w:r>
+        <w:rPr>
+          <w:b/>
+          <w:bCs/>
+          <w:lang w:val="fr-FR"/>
+        </w:rPr>
+        <w:t xml:space="preserve">6. </w:t>
+      </w:r>
+      <w:proofErr w:type="spellStart"/>
+      <w:r>
+        <w:rPr>
+          <w:b/>
+          <w:bCs/>
+          <w:lang w:val="fr-FR"/>
+        </w:rPr>
+        <w:t>Playbook</w:t>
+      </w:r>
+      <w:proofErr w:type="spellEnd"/>
+      <w:r>
+        <w:rPr>
+          <w:b/>
+          <w:bCs/>
+          <w:lang w:val="fr-FR"/>
+        </w:rPr>
+        <w:t xml:space="preserve"> de reprise (prochaines actions)</w:t>
+      </w:r>
+    </w:p>
+    <w:p>
+      <w:pPr>
+        <w:rPr>
+          <w:b/>
+          <w:lang w:val="fr-FR"/>
+        </w:rPr>
+      </w:pPr>
+      <w:r>
+        <w:rPr>
+          <w:b/>
+          <w:lang w:val="fr-FR"/>
+        </w:rPr>
+        <w:t>Conformément à votre demande, voici les prochaines étapes :</w:t>
+      </w:r>
+    </w:p>
+    <w:p>
+      <w:pPr>
+        <w:numPr>
+          <w:ilvl w:val="0"/>
+          <w:numId w:val="206"/>
+        </w:numPr>
+        <w:rPr>
+          <w:b/>
+          <w:lang w:val="fr-FR"/>
+        </w:rPr>
+      </w:pPr>
+      <w:r>
+        <w:rPr>
+          <w:b/>
+          <w:bCs/>
+          <w:lang w:val="fr-FR"/>
+        </w:rPr>
+        <w:t>[ ] (Cet après-midi)</w:t>
+      </w:r>
+      <w:r>
+        <w:rPr>
+          <w:b/>
+          <w:lang w:val="fr-FR"/>
+        </w:rPr>
+        <w:t xml:space="preserve"> : Vérifier la configuration et la logique des tests </w:t>
+      </w:r>
+      <w:r>
+        <w:rPr>
+          <w:b/>
+          <w:bCs/>
+          <w:lang w:val="fr-FR"/>
+        </w:rPr>
+        <w:t>r&amp;K</w:t>
+      </w:r>
+      <w:r>
+        <w:rPr>
+          <w:b/>
+          <w:lang w:val="fr-FR"/>
+        </w:rPr>
+        <w:t xml:space="preserve"> (Adaptabilité, Résilience, Créativité) pour s'assurer qu'ils sont correctement paramétrés.</w:t>
+      </w:r>
+    </w:p>
+    <w:p>
+      <w:pPr>
+        <w:numPr>
+          <w:ilvl w:val="0"/>
+          <w:numId w:val="206"/>
+        </w:numPr>
+        <w:rPr>
+          <w:b/>
+          <w:lang w:val="fr-FR"/>
+        </w:rPr>
+      </w:pPr>
+      <w:r>
+        <w:rPr>
+          <w:b/>
+          <w:bCs/>
+          <w:lang w:val="fr-FR"/>
+        </w:rPr>
+        <w:t>[ ] (Ce soir)</w:t>
+      </w:r>
+      <w:r>
+        <w:rPr>
+          <w:b/>
+          <w:lang w:val="fr-FR"/>
+        </w:rPr>
+        <w:t xml:space="preserve"> : Lancer une campagne de génération pour </w:t>
+      </w:r>
+      <w:r>
+        <w:rPr>
+          <w:b/>
+          <w:bCs/>
+          <w:lang w:val="fr-FR"/>
+        </w:rPr>
+        <w:t>tous les tests majeurs</w:t>
+      </w:r>
+      <w:r>
+        <w:rPr>
+          <w:b/>
+          <w:lang w:val="fr-FR"/>
+        </w:rPr>
+        <w:t xml:space="preserve">. L'objectif est de valider l'absence de régression </w:t>
+      </w:r>
+      <w:proofErr w:type="gramStart"/>
+      <w:r>
+        <w:rPr>
+          <w:b/>
+          <w:lang w:val="fr-FR"/>
+        </w:rPr>
+        <w:t>suite aux</w:t>
+      </w:r>
+      <w:proofErr w:type="gramEnd"/>
+      <w:r>
+        <w:rPr>
+          <w:b/>
+          <w:lang w:val="fr-FR"/>
+        </w:rPr>
+        <w:t xml:space="preserve"> récentes modifications de la BDD.</w:t>
+      </w:r>
+    </w:p>
+    <w:p>
+      <w:pPr>
+        <w:rPr>
+          <w:b/>
         </w:rPr>
       </w:pPr>
     </w:p>
@@ -4357,6 +5478,155 @@
     </w:lvl>
   </w:abstractNum>
   <w:abstractNum w:abstractNumId="25" w15:restartNumberingAfterBreak="0">
+    <w:nsid w:val="10F66276"/>
+    <w:multiLevelType w:val="multilevel"/>
+    <w:tmpl w:val="36A85076"/>
+    <w:lvl w:ilvl="0">
+      <w:start w:val="1"/>
+      <w:numFmt w:val="bullet"/>
+      <w:lvlText w:val=""/>
+      <w:lvlJc w:val="left"/>
+      <w:pPr>
+        <w:tabs>
+          <w:tab w:val="num" w:pos="720"/>
+        </w:tabs>
+        <w:ind w:left="720" w:hanging="360"/>
+      </w:pPr>
+      <w:rPr>
+        <w:rFonts w:ascii="Symbol" w:hAnsi="Symbol" w:hint="default"/>
+        <w:sz w:val="20"/>
+      </w:rPr>
+    </w:lvl>
+    <w:lvl w:ilvl="1" w:tentative="1">
+      <w:start w:val="1"/>
+      <w:numFmt w:val="bullet"/>
+      <w:lvlText w:val="o"/>
+      <w:lvlJc w:val="left"/>
+      <w:pPr>
+        <w:tabs>
+          <w:tab w:val="num" w:pos="1440"/>
+        </w:tabs>
+        <w:ind w:left="1440" w:hanging="360"/>
+      </w:pPr>
+      <w:rPr>
+        <w:rFonts w:ascii="Courier New" w:hAnsi="Courier New" w:hint="default"/>
+        <w:sz w:val="20"/>
+      </w:rPr>
+    </w:lvl>
+    <w:lvl w:ilvl="2" w:tentative="1">
+      <w:start w:val="1"/>
+      <w:numFmt w:val="bullet"/>
+      <w:lvlText w:val=""/>
+      <w:lvlJc w:val="left"/>
+      <w:pPr>
+        <w:tabs>
+          <w:tab w:val="num" w:pos="2160"/>
+        </w:tabs>
+        <w:ind w:left="2160" w:hanging="360"/>
+      </w:pPr>
+      <w:rPr>
+        <w:rFonts w:ascii="Wingdings" w:hAnsi="Wingdings" w:hint="default"/>
+        <w:sz w:val="20"/>
+      </w:rPr>
+    </w:lvl>
+    <w:lvl w:ilvl="3" w:tentative="1">
+      <w:start w:val="1"/>
+      <w:numFmt w:val="bullet"/>
+      <w:lvlText w:val=""/>
+      <w:lvlJc w:val="left"/>
+      <w:pPr>
+        <w:tabs>
+          <w:tab w:val="num" w:pos="2880"/>
+        </w:tabs>
+        <w:ind w:left="2880" w:hanging="360"/>
+      </w:pPr>
+      <w:rPr>
+        <w:rFonts w:ascii="Wingdings" w:hAnsi="Wingdings" w:hint="default"/>
+        <w:sz w:val="20"/>
+      </w:rPr>
+    </w:lvl>
+    <w:lvl w:ilvl="4" w:tentative="1">
+      <w:start w:val="1"/>
+      <w:numFmt w:val="bullet"/>
+      <w:lvlText w:val=""/>
+      <w:lvlJc w:val="left"/>
+      <w:pPr>
+        <w:tabs>
+          <w:tab w:val="num" w:pos="3600"/>
+        </w:tabs>
+        <w:ind w:left="3600" w:hanging="360"/>
+      </w:pPr>
+      <w:rPr>
+        <w:rFonts w:ascii="Wingdings" w:hAnsi="Wingdings" w:hint="default"/>
+        <w:sz w:val="20"/>
+      </w:rPr>
+    </w:lvl>
+    <w:lvl w:ilvl="5" w:tentative="1">
+      <w:start w:val="1"/>
+      <w:numFmt w:val="bullet"/>
+      <w:lvlText w:val=""/>
+      <w:lvlJc w:val="left"/>
+      <w:pPr>
+        <w:tabs>
+          <w:tab w:val="num" w:pos="4320"/>
+        </w:tabs>
+        <w:ind w:left="4320" w:hanging="360"/>
+      </w:pPr>
+      <w:rPr>
+        <w:rFonts w:ascii="Wingdings" w:hAnsi="Wingdings" w:hint="default"/>
+        <w:sz w:val="20"/>
+      </w:rPr>
+    </w:lvl>
+    <w:lvl w:ilvl="6" w:tentative="1">
+      <w:start w:val="1"/>
+      <w:numFmt w:val="bullet"/>
+      <w:lvlText w:val=""/>
+      <w:lvlJc w:val="left"/>
+      <w:pPr>
+        <w:tabs>
+          <w:tab w:val="num" w:pos="5040"/>
+        </w:tabs>
+        <w:ind w:left="5040" w:hanging="360"/>
+      </w:pPr>
+      <w:rPr>
+        <w:rFonts w:ascii="Wingdings" w:hAnsi="Wingdings" w:hint="default"/>
+        <w:sz w:val="20"/>
+      </w:rPr>
+    </w:lvl>
+    <w:lvl w:ilvl="7" w:tentative="1">
+      <w:start w:val="1"/>
+      <w:numFmt w:val="bullet"/>
+      <w:lvlText w:val=""/>
+      <w:lvlJc w:val="left"/>
+      <w:pPr>
+        <w:tabs>
+          <w:tab w:val="num" w:pos="5760"/>
+        </w:tabs>
+        <w:ind w:left="5760" w:hanging="360"/>
+      </w:pPr>
+      <w:rPr>
+        <w:rFonts w:ascii="Wingdings" w:hAnsi="Wingdings" w:hint="default"/>
+        <w:sz w:val="20"/>
+      </w:rPr>
+    </w:lvl>
+    <w:lvl w:ilvl="8" w:tentative="1">
+      <w:start w:val="1"/>
+      <w:numFmt w:val="bullet"/>
+      <w:lvlText w:val=""/>
+      <w:lvlJc w:val="left"/>
+      <w:pPr>
+        <w:tabs>
+          <w:tab w:val="num" w:pos="6480"/>
+        </w:tabs>
+        <w:ind w:left="6480" w:hanging="360"/>
+      </w:pPr>
+      <w:rPr>
+        <w:rFonts w:ascii="Wingdings" w:hAnsi="Wingdings" w:hint="default"/>
+        <w:sz w:val="20"/>
+      </w:rPr>
+    </w:lvl>
+  </w:abstractNum>
+  <w:abstractNum w:abstractNumId="26" w15:restartNumberingAfterBreak="0">
     <w:nsid w:val="10FA01BD"/>
     <w:multiLevelType w:val="multilevel"/>
     <w:tmpl w:val="C54A5062"/>
@@ -4505,7 +5775,7 @@
       </w:rPr>
     </w:lvl>
   </w:abstractNum>
-  <w:abstractNum w:abstractNumId="26" w15:restartNumberingAfterBreak="0">
+  <w:abstractNum w:abstractNumId="27" w15:restartNumberingAfterBreak="0">
     <w:nsid w:val="11924B02"/>
     <w:multiLevelType w:val="multilevel"/>
     <w:tmpl w:val="AF0833D6"/>
@@ -4654,7 +5924,7 @@
       </w:rPr>
     </w:lvl>
   </w:abstractNum>
-  <w:abstractNum w:abstractNumId="27" w15:restartNumberingAfterBreak="0">
+  <w:abstractNum w:abstractNumId="28" w15:restartNumberingAfterBreak="0">
     <w:nsid w:val="123B16BD"/>
     <w:multiLevelType w:val="multilevel"/>
     <w:tmpl w:val="0B1C7D2E"/>
@@ -4803,7 +6073,7 @@
       </w:rPr>
     </w:lvl>
   </w:abstractNum>
-  <w:abstractNum w:abstractNumId="28" w15:restartNumberingAfterBreak="0">
+  <w:abstractNum w:abstractNumId="29" w15:restartNumberingAfterBreak="0">
     <w:nsid w:val="123E1A59"/>
     <w:multiLevelType w:val="multilevel"/>
     <w:tmpl w:val="E118F50E"/>
@@ -4952,7 +6222,7 @@
       </w:rPr>
     </w:lvl>
   </w:abstractNum>
-  <w:abstractNum w:abstractNumId="29" w15:restartNumberingAfterBreak="0">
+  <w:abstractNum w:abstractNumId="30" w15:restartNumberingAfterBreak="0">
     <w:nsid w:val="12420EA7"/>
     <w:multiLevelType w:val="multilevel"/>
     <w:tmpl w:val="A224C4E0"/>
@@ -5101,7 +6371,7 @@
       </w:rPr>
     </w:lvl>
   </w:abstractNum>
-  <w:abstractNum w:abstractNumId="30" w15:restartNumberingAfterBreak="0">
+  <w:abstractNum w:abstractNumId="31" w15:restartNumberingAfterBreak="0">
     <w:nsid w:val="14E72739"/>
     <w:multiLevelType w:val="multilevel"/>
     <w:tmpl w:val="E734651C"/>
@@ -5250,7 +6520,7 @@
       </w:rPr>
     </w:lvl>
   </w:abstractNum>
-  <w:abstractNum w:abstractNumId="31" w15:restartNumberingAfterBreak="0">
+  <w:abstractNum w:abstractNumId="32" w15:restartNumberingAfterBreak="0">
     <w:nsid w:val="15603496"/>
     <w:multiLevelType w:val="multilevel"/>
     <w:tmpl w:val="3D347110"/>
@@ -5399,7 +6669,7 @@
       </w:rPr>
     </w:lvl>
   </w:abstractNum>
-  <w:abstractNum w:abstractNumId="32" w15:restartNumberingAfterBreak="0">
+  <w:abstractNum w:abstractNumId="33" w15:restartNumberingAfterBreak="0">
     <w:nsid w:val="157849C5"/>
     <w:multiLevelType w:val="multilevel"/>
     <w:tmpl w:val="95160960"/>
@@ -5544,7 +6814,7 @@
       </w:rPr>
     </w:lvl>
   </w:abstractNum>
-  <w:abstractNum w:abstractNumId="33" w15:restartNumberingAfterBreak="0">
+  <w:abstractNum w:abstractNumId="34" w15:restartNumberingAfterBreak="0">
     <w:nsid w:val="15C424D4"/>
     <w:multiLevelType w:val="multilevel"/>
     <w:tmpl w:val="06180846"/>
@@ -5693,7 +6963,7 @@
       </w:rPr>
     </w:lvl>
   </w:abstractNum>
-  <w:abstractNum w:abstractNumId="34" w15:restartNumberingAfterBreak="0">
+  <w:abstractNum w:abstractNumId="35" w15:restartNumberingAfterBreak="0">
     <w:nsid w:val="17CA4F60"/>
     <w:multiLevelType w:val="multilevel"/>
     <w:tmpl w:val="BC3AA624"/>
@@ -5842,7 +7112,7 @@
       </w:rPr>
     </w:lvl>
   </w:abstractNum>
-  <w:abstractNum w:abstractNumId="35" w15:restartNumberingAfterBreak="0">
+  <w:abstractNum w:abstractNumId="36" w15:restartNumberingAfterBreak="0">
     <w:nsid w:val="17F12882"/>
     <w:multiLevelType w:val="multilevel"/>
     <w:tmpl w:val="96FE2836"/>
@@ -5955,7 +7225,7 @@
       </w:pPr>
     </w:lvl>
   </w:abstractNum>
-  <w:abstractNum w:abstractNumId="36" w15:restartNumberingAfterBreak="0">
+  <w:abstractNum w:abstractNumId="37" w15:restartNumberingAfterBreak="0">
     <w:nsid w:val="185E08BF"/>
     <w:multiLevelType w:val="multilevel"/>
     <w:tmpl w:val="5F103C7E"/>
@@ -6104,7 +7374,7 @@
       </w:rPr>
     </w:lvl>
   </w:abstractNum>
-  <w:abstractNum w:abstractNumId="37" w15:restartNumberingAfterBreak="0">
+  <w:abstractNum w:abstractNumId="38" w15:restartNumberingAfterBreak="0">
     <w:nsid w:val="18651572"/>
     <w:multiLevelType w:val="multilevel"/>
     <w:tmpl w:val="B5CA9D30"/>
@@ -6221,7 +7491,7 @@
       </w:pPr>
     </w:lvl>
   </w:abstractNum>
-  <w:abstractNum w:abstractNumId="38" w15:restartNumberingAfterBreak="0">
+  <w:abstractNum w:abstractNumId="39" w15:restartNumberingAfterBreak="0">
     <w:nsid w:val="191875E5"/>
     <w:multiLevelType w:val="multilevel"/>
     <w:tmpl w:val="4EDCCAC0"/>
@@ -6370,7 +7640,156 @@
       </w:rPr>
     </w:lvl>
   </w:abstractNum>
-  <w:abstractNum w:abstractNumId="39" w15:restartNumberingAfterBreak="0">
+  <w:abstractNum w:abstractNumId="40" w15:restartNumberingAfterBreak="0">
+    <w:nsid w:val="1A3647D0"/>
+    <w:multiLevelType w:val="multilevel"/>
+    <w:tmpl w:val="798E9A44"/>
+    <w:lvl w:ilvl="0">
+      <w:start w:val="1"/>
+      <w:numFmt w:val="bullet"/>
+      <w:lvlText w:val=""/>
+      <w:lvlJc w:val="left"/>
+      <w:pPr>
+        <w:tabs>
+          <w:tab w:val="num" w:pos="720"/>
+        </w:tabs>
+        <w:ind w:left="720" w:hanging="360"/>
+      </w:pPr>
+      <w:rPr>
+        <w:rFonts w:ascii="Symbol" w:hAnsi="Symbol" w:hint="default"/>
+        <w:sz w:val="20"/>
+      </w:rPr>
+    </w:lvl>
+    <w:lvl w:ilvl="1" w:tentative="1">
+      <w:start w:val="1"/>
+      <w:numFmt w:val="bullet"/>
+      <w:lvlText w:val="o"/>
+      <w:lvlJc w:val="left"/>
+      <w:pPr>
+        <w:tabs>
+          <w:tab w:val="num" w:pos="1440"/>
+        </w:tabs>
+        <w:ind w:left="1440" w:hanging="360"/>
+      </w:pPr>
+      <w:rPr>
+        <w:rFonts w:ascii="Courier New" w:hAnsi="Courier New" w:hint="default"/>
+        <w:sz w:val="20"/>
+      </w:rPr>
+    </w:lvl>
+    <w:lvl w:ilvl="2" w:tentative="1">
+      <w:start w:val="1"/>
+      <w:numFmt w:val="bullet"/>
+      <w:lvlText w:val=""/>
+      <w:lvlJc w:val="left"/>
+      <w:pPr>
+        <w:tabs>
+          <w:tab w:val="num" w:pos="2160"/>
+        </w:tabs>
+        <w:ind w:left="2160" w:hanging="360"/>
+      </w:pPr>
+      <w:rPr>
+        <w:rFonts w:ascii="Wingdings" w:hAnsi="Wingdings" w:hint="default"/>
+        <w:sz w:val="20"/>
+      </w:rPr>
+    </w:lvl>
+    <w:lvl w:ilvl="3" w:tentative="1">
+      <w:start w:val="1"/>
+      <w:numFmt w:val="bullet"/>
+      <w:lvlText w:val=""/>
+      <w:lvlJc w:val="left"/>
+      <w:pPr>
+        <w:tabs>
+          <w:tab w:val="num" w:pos="2880"/>
+        </w:tabs>
+        <w:ind w:left="2880" w:hanging="360"/>
+      </w:pPr>
+      <w:rPr>
+        <w:rFonts w:ascii="Wingdings" w:hAnsi="Wingdings" w:hint="default"/>
+        <w:sz w:val="20"/>
+      </w:rPr>
+    </w:lvl>
+    <w:lvl w:ilvl="4" w:tentative="1">
+      <w:start w:val="1"/>
+      <w:numFmt w:val="bullet"/>
+      <w:lvlText w:val=""/>
+      <w:lvlJc w:val="left"/>
+      <w:pPr>
+        <w:tabs>
+          <w:tab w:val="num" w:pos="3600"/>
+        </w:tabs>
+        <w:ind w:left="3600" w:hanging="360"/>
+      </w:pPr>
+      <w:rPr>
+        <w:rFonts w:ascii="Wingdings" w:hAnsi="Wingdings" w:hint="default"/>
+        <w:sz w:val="20"/>
+      </w:rPr>
+    </w:lvl>
+    <w:lvl w:ilvl="5" w:tentative="1">
+      <w:start w:val="1"/>
+      <w:numFmt w:val="bullet"/>
+      <w:lvlText w:val=""/>
+      <w:lvlJc w:val="left"/>
+      <w:pPr>
+        <w:tabs>
+          <w:tab w:val="num" w:pos="4320"/>
+        </w:tabs>
+        <w:ind w:left="4320" w:hanging="360"/>
+      </w:pPr>
+      <w:rPr>
+        <w:rFonts w:ascii="Wingdings" w:hAnsi="Wingdings" w:hint="default"/>
+        <w:sz w:val="20"/>
+      </w:rPr>
+    </w:lvl>
+    <w:lvl w:ilvl="6" w:tentative="1">
+      <w:start w:val="1"/>
+      <w:numFmt w:val="bullet"/>
+      <w:lvlText w:val=""/>
+      <w:lvlJc w:val="left"/>
+      <w:pPr>
+        <w:tabs>
+          <w:tab w:val="num" w:pos="5040"/>
+        </w:tabs>
+        <w:ind w:left="5040" w:hanging="360"/>
+      </w:pPr>
+      <w:rPr>
+        <w:rFonts w:ascii="Wingdings" w:hAnsi="Wingdings" w:hint="default"/>
+        <w:sz w:val="20"/>
+      </w:rPr>
+    </w:lvl>
+    <w:lvl w:ilvl="7" w:tentative="1">
+      <w:start w:val="1"/>
+      <w:numFmt w:val="bullet"/>
+      <w:lvlText w:val=""/>
+      <w:lvlJc w:val="left"/>
+      <w:pPr>
+        <w:tabs>
+          <w:tab w:val="num" w:pos="5760"/>
+        </w:tabs>
+        <w:ind w:left="5760" w:hanging="360"/>
+      </w:pPr>
+      <w:rPr>
+        <w:rFonts w:ascii="Wingdings" w:hAnsi="Wingdings" w:hint="default"/>
+        <w:sz w:val="20"/>
+      </w:rPr>
+    </w:lvl>
+    <w:lvl w:ilvl="8" w:tentative="1">
+      <w:start w:val="1"/>
+      <w:numFmt w:val="bullet"/>
+      <w:lvlText w:val=""/>
+      <w:lvlJc w:val="left"/>
+      <w:pPr>
+        <w:tabs>
+          <w:tab w:val="num" w:pos="6480"/>
+        </w:tabs>
+        <w:ind w:left="6480" w:hanging="360"/>
+      </w:pPr>
+      <w:rPr>
+        <w:rFonts w:ascii="Wingdings" w:hAnsi="Wingdings" w:hint="default"/>
+        <w:sz w:val="20"/>
+      </w:rPr>
+    </w:lvl>
+  </w:abstractNum>
+  <w:abstractNum w:abstractNumId="41" w15:restartNumberingAfterBreak="0">
     <w:nsid w:val="1AA4323F"/>
     <w:multiLevelType w:val="multilevel"/>
     <w:tmpl w:val="CC58D4D4"/>
@@ -6519,7 +7938,7 @@
       </w:rPr>
     </w:lvl>
   </w:abstractNum>
-  <w:abstractNum w:abstractNumId="40" w15:restartNumberingAfterBreak="0">
+  <w:abstractNum w:abstractNumId="42" w15:restartNumberingAfterBreak="0">
     <w:nsid w:val="1B3167B2"/>
     <w:multiLevelType w:val="multilevel"/>
     <w:tmpl w:val="E7E26794"/>
@@ -6632,7 +8051,7 @@
       </w:pPr>
     </w:lvl>
   </w:abstractNum>
-  <w:abstractNum w:abstractNumId="41" w15:restartNumberingAfterBreak="0">
+  <w:abstractNum w:abstractNumId="43" w15:restartNumberingAfterBreak="0">
     <w:nsid w:val="1B99755A"/>
     <w:multiLevelType w:val="multilevel"/>
     <w:tmpl w:val="89FE580E"/>
@@ -6777,7 +8196,7 @@
       </w:rPr>
     </w:lvl>
   </w:abstractNum>
-  <w:abstractNum w:abstractNumId="42" w15:restartNumberingAfterBreak="0">
+  <w:abstractNum w:abstractNumId="44" w15:restartNumberingAfterBreak="0">
     <w:nsid w:val="1CAA589A"/>
     <w:multiLevelType w:val="multilevel"/>
     <w:tmpl w:val="CE5E86F0"/>
@@ -6926,7 +8345,7 @@
       </w:rPr>
     </w:lvl>
   </w:abstractNum>
-  <w:abstractNum w:abstractNumId="43" w15:restartNumberingAfterBreak="0">
+  <w:abstractNum w:abstractNumId="45" w15:restartNumberingAfterBreak="0">
     <w:nsid w:val="1E0E24A4"/>
     <w:multiLevelType w:val="multilevel"/>
     <w:tmpl w:val="A13C266E"/>
@@ -7075,7 +8494,7 @@
       </w:rPr>
     </w:lvl>
   </w:abstractNum>
-  <w:abstractNum w:abstractNumId="44" w15:restartNumberingAfterBreak="0">
+  <w:abstractNum w:abstractNumId="46" w15:restartNumberingAfterBreak="0">
     <w:nsid w:val="1F385A51"/>
     <w:multiLevelType w:val="multilevel"/>
     <w:tmpl w:val="60481A0A"/>
@@ -7224,7 +8643,7 @@
       </w:rPr>
     </w:lvl>
   </w:abstractNum>
-  <w:abstractNum w:abstractNumId="45" w15:restartNumberingAfterBreak="0">
+  <w:abstractNum w:abstractNumId="47" w15:restartNumberingAfterBreak="0">
     <w:nsid w:val="1F583C84"/>
     <w:multiLevelType w:val="multilevel"/>
     <w:tmpl w:val="C40A3056"/>
@@ -7373,7 +8792,7 @@
       </w:rPr>
     </w:lvl>
   </w:abstractNum>
-  <w:abstractNum w:abstractNumId="46" w15:restartNumberingAfterBreak="0">
+  <w:abstractNum w:abstractNumId="48" w15:restartNumberingAfterBreak="0">
     <w:nsid w:val="20591B3C"/>
     <w:multiLevelType w:val="multilevel"/>
     <w:tmpl w:val="2480B1BE"/>
@@ -7522,7 +8941,7 @@
       </w:rPr>
     </w:lvl>
   </w:abstractNum>
-  <w:abstractNum w:abstractNumId="47" w15:restartNumberingAfterBreak="0">
+  <w:abstractNum w:abstractNumId="49" w15:restartNumberingAfterBreak="0">
     <w:nsid w:val="20621635"/>
     <w:multiLevelType w:val="multilevel"/>
     <w:tmpl w:val="5BD0905E"/>
@@ -7671,7 +9090,7 @@
       </w:rPr>
     </w:lvl>
   </w:abstractNum>
-  <w:abstractNum w:abstractNumId="48" w15:restartNumberingAfterBreak="0">
+  <w:abstractNum w:abstractNumId="50" w15:restartNumberingAfterBreak="0">
     <w:nsid w:val="213349DB"/>
     <w:multiLevelType w:val="multilevel"/>
     <w:tmpl w:val="4AFC3B32"/>
@@ -7820,7 +9239,7 @@
       </w:rPr>
     </w:lvl>
   </w:abstractNum>
-  <w:abstractNum w:abstractNumId="49" w15:restartNumberingAfterBreak="0">
+  <w:abstractNum w:abstractNumId="51" w15:restartNumberingAfterBreak="0">
     <w:nsid w:val="217F43C1"/>
     <w:multiLevelType w:val="multilevel"/>
     <w:tmpl w:val="F0220F10"/>
@@ -7933,7 +9352,7 @@
       </w:pPr>
     </w:lvl>
   </w:abstractNum>
-  <w:abstractNum w:abstractNumId="50" w15:restartNumberingAfterBreak="0">
+  <w:abstractNum w:abstractNumId="52" w15:restartNumberingAfterBreak="0">
     <w:nsid w:val="2192120E"/>
     <w:multiLevelType w:val="multilevel"/>
     <w:tmpl w:val="BD4C9456"/>
@@ -8082,7 +9501,7 @@
       </w:rPr>
     </w:lvl>
   </w:abstractNum>
-  <w:abstractNum w:abstractNumId="51" w15:restartNumberingAfterBreak="0">
+  <w:abstractNum w:abstractNumId="53" w15:restartNumberingAfterBreak="0">
     <w:nsid w:val="22AA0F8A"/>
     <w:multiLevelType w:val="multilevel"/>
     <w:tmpl w:val="92BCA216"/>
@@ -8195,7 +9614,7 @@
       </w:pPr>
     </w:lvl>
   </w:abstractNum>
-  <w:abstractNum w:abstractNumId="52" w15:restartNumberingAfterBreak="0">
+  <w:abstractNum w:abstractNumId="54" w15:restartNumberingAfterBreak="0">
     <w:nsid w:val="22B52B00"/>
     <w:multiLevelType w:val="multilevel"/>
     <w:tmpl w:val="9E767F18"/>
@@ -8344,7 +9763,7 @@
       </w:rPr>
     </w:lvl>
   </w:abstractNum>
-  <w:abstractNum w:abstractNumId="53" w15:restartNumberingAfterBreak="0">
+  <w:abstractNum w:abstractNumId="55" w15:restartNumberingAfterBreak="0">
     <w:nsid w:val="22DC7E5C"/>
     <w:multiLevelType w:val="multilevel"/>
     <w:tmpl w:val="A27E455A"/>
@@ -8493,7 +9912,7 @@
       </w:rPr>
     </w:lvl>
   </w:abstractNum>
-  <w:abstractNum w:abstractNumId="54" w15:restartNumberingAfterBreak="0">
+  <w:abstractNum w:abstractNumId="56" w15:restartNumberingAfterBreak="0">
     <w:nsid w:val="249F1718"/>
     <w:multiLevelType w:val="multilevel"/>
     <w:tmpl w:val="6DF81AA2"/>
@@ -8638,7 +10057,156 @@
       </w:rPr>
     </w:lvl>
   </w:abstractNum>
-  <w:abstractNum w:abstractNumId="55" w15:restartNumberingAfterBreak="0">
+  <w:abstractNum w:abstractNumId="57" w15:restartNumberingAfterBreak="0">
+    <w:nsid w:val="2658392C"/>
+    <w:multiLevelType w:val="multilevel"/>
+    <w:tmpl w:val="0FFC8E4E"/>
+    <w:lvl w:ilvl="0">
+      <w:start w:val="1"/>
+      <w:numFmt w:val="bullet"/>
+      <w:lvlText w:val=""/>
+      <w:lvlJc w:val="left"/>
+      <w:pPr>
+        <w:tabs>
+          <w:tab w:val="num" w:pos="720"/>
+        </w:tabs>
+        <w:ind w:left="720" w:hanging="360"/>
+      </w:pPr>
+      <w:rPr>
+        <w:rFonts w:ascii="Symbol" w:hAnsi="Symbol" w:hint="default"/>
+        <w:sz w:val="20"/>
+      </w:rPr>
+    </w:lvl>
+    <w:lvl w:ilvl="1" w:tentative="1">
+      <w:start w:val="1"/>
+      <w:numFmt w:val="bullet"/>
+      <w:lvlText w:val="o"/>
+      <w:lvlJc w:val="left"/>
+      <w:pPr>
+        <w:tabs>
+          <w:tab w:val="num" w:pos="1440"/>
+        </w:tabs>
+        <w:ind w:left="1440" w:hanging="360"/>
+      </w:pPr>
+      <w:rPr>
+        <w:rFonts w:ascii="Courier New" w:hAnsi="Courier New" w:hint="default"/>
+        <w:sz w:val="20"/>
+      </w:rPr>
+    </w:lvl>
+    <w:lvl w:ilvl="2" w:tentative="1">
+      <w:start w:val="1"/>
+      <w:numFmt w:val="bullet"/>
+      <w:lvlText w:val=""/>
+      <w:lvlJc w:val="left"/>
+      <w:pPr>
+        <w:tabs>
+          <w:tab w:val="num" w:pos="2160"/>
+        </w:tabs>
+        <w:ind w:left="2160" w:hanging="360"/>
+      </w:pPr>
+      <w:rPr>
+        <w:rFonts w:ascii="Wingdings" w:hAnsi="Wingdings" w:hint="default"/>
+        <w:sz w:val="20"/>
+      </w:rPr>
+    </w:lvl>
+    <w:lvl w:ilvl="3" w:tentative="1">
+      <w:start w:val="1"/>
+      <w:numFmt w:val="bullet"/>
+      <w:lvlText w:val=""/>
+      <w:lvlJc w:val="left"/>
+      <w:pPr>
+        <w:tabs>
+          <w:tab w:val="num" w:pos="2880"/>
+        </w:tabs>
+        <w:ind w:left="2880" w:hanging="360"/>
+      </w:pPr>
+      <w:rPr>
+        <w:rFonts w:ascii="Wingdings" w:hAnsi="Wingdings" w:hint="default"/>
+        <w:sz w:val="20"/>
+      </w:rPr>
+    </w:lvl>
+    <w:lvl w:ilvl="4" w:tentative="1">
+      <w:start w:val="1"/>
+      <w:numFmt w:val="bullet"/>
+      <w:lvlText w:val=""/>
+      <w:lvlJc w:val="left"/>
+      <w:pPr>
+        <w:tabs>
+          <w:tab w:val="num" w:pos="3600"/>
+        </w:tabs>
+        <w:ind w:left="3600" w:hanging="360"/>
+      </w:pPr>
+      <w:rPr>
+        <w:rFonts w:ascii="Wingdings" w:hAnsi="Wingdings" w:hint="default"/>
+        <w:sz w:val="20"/>
+      </w:rPr>
+    </w:lvl>
+    <w:lvl w:ilvl="5" w:tentative="1">
+      <w:start w:val="1"/>
+      <w:numFmt w:val="bullet"/>
+      <w:lvlText w:val=""/>
+      <w:lvlJc w:val="left"/>
+      <w:pPr>
+        <w:tabs>
+          <w:tab w:val="num" w:pos="4320"/>
+        </w:tabs>
+        <w:ind w:left="4320" w:hanging="360"/>
+      </w:pPr>
+      <w:rPr>
+        <w:rFonts w:ascii="Wingdings" w:hAnsi="Wingdings" w:hint="default"/>
+        <w:sz w:val="20"/>
+      </w:rPr>
+    </w:lvl>
+    <w:lvl w:ilvl="6" w:tentative="1">
+      <w:start w:val="1"/>
+      <w:numFmt w:val="bullet"/>
+      <w:lvlText w:val=""/>
+      <w:lvlJc w:val="left"/>
+      <w:pPr>
+        <w:tabs>
+          <w:tab w:val="num" w:pos="5040"/>
+        </w:tabs>
+        <w:ind w:left="5040" w:hanging="360"/>
+      </w:pPr>
+      <w:rPr>
+        <w:rFonts w:ascii="Wingdings" w:hAnsi="Wingdings" w:hint="default"/>
+        <w:sz w:val="20"/>
+      </w:rPr>
+    </w:lvl>
+    <w:lvl w:ilvl="7" w:tentative="1">
+      <w:start w:val="1"/>
+      <w:numFmt w:val="bullet"/>
+      <w:lvlText w:val=""/>
+      <w:lvlJc w:val="left"/>
+      <w:pPr>
+        <w:tabs>
+          <w:tab w:val="num" w:pos="5760"/>
+        </w:tabs>
+        <w:ind w:left="5760" w:hanging="360"/>
+      </w:pPr>
+      <w:rPr>
+        <w:rFonts w:ascii="Wingdings" w:hAnsi="Wingdings" w:hint="default"/>
+        <w:sz w:val="20"/>
+      </w:rPr>
+    </w:lvl>
+    <w:lvl w:ilvl="8" w:tentative="1">
+      <w:start w:val="1"/>
+      <w:numFmt w:val="bullet"/>
+      <w:lvlText w:val=""/>
+      <w:lvlJc w:val="left"/>
+      <w:pPr>
+        <w:tabs>
+          <w:tab w:val="num" w:pos="6480"/>
+        </w:tabs>
+        <w:ind w:left="6480" w:hanging="360"/>
+      </w:pPr>
+      <w:rPr>
+        <w:rFonts w:ascii="Wingdings" w:hAnsi="Wingdings" w:hint="default"/>
+        <w:sz w:val="20"/>
+      </w:rPr>
+    </w:lvl>
+  </w:abstractNum>
+  <w:abstractNum w:abstractNumId="58" w15:restartNumberingAfterBreak="0">
     <w:nsid w:val="26954AD8"/>
     <w:multiLevelType w:val="multilevel"/>
     <w:tmpl w:val="0966F958"/>
@@ -8787,7 +10355,7 @@
       </w:rPr>
     </w:lvl>
   </w:abstractNum>
-  <w:abstractNum w:abstractNumId="56" w15:restartNumberingAfterBreak="0">
+  <w:abstractNum w:abstractNumId="59" w15:restartNumberingAfterBreak="0">
     <w:nsid w:val="26E90392"/>
     <w:multiLevelType w:val="multilevel"/>
     <w:tmpl w:val="66205C80"/>
@@ -8936,7 +10504,7 @@
       </w:rPr>
     </w:lvl>
   </w:abstractNum>
-  <w:abstractNum w:abstractNumId="57" w15:restartNumberingAfterBreak="0">
+  <w:abstractNum w:abstractNumId="60" w15:restartNumberingAfterBreak="0">
     <w:nsid w:val="2702256E"/>
     <w:multiLevelType w:val="multilevel"/>
     <w:tmpl w:val="5ED8DE04"/>
@@ -9085,7 +10653,7 @@
       </w:rPr>
     </w:lvl>
   </w:abstractNum>
-  <w:abstractNum w:abstractNumId="58" w15:restartNumberingAfterBreak="0">
+  <w:abstractNum w:abstractNumId="61" w15:restartNumberingAfterBreak="0">
     <w:nsid w:val="270A60B9"/>
     <w:multiLevelType w:val="multilevel"/>
     <w:tmpl w:val="A7D650BA"/>
@@ -9234,7 +10802,7 @@
       </w:rPr>
     </w:lvl>
   </w:abstractNum>
-  <w:abstractNum w:abstractNumId="59" w15:restartNumberingAfterBreak="0">
+  <w:abstractNum w:abstractNumId="62" w15:restartNumberingAfterBreak="0">
     <w:nsid w:val="27B632EE"/>
     <w:multiLevelType w:val="multilevel"/>
     <w:tmpl w:val="0ABA00CC"/>
@@ -9383,7 +10951,7 @@
       </w:rPr>
     </w:lvl>
   </w:abstractNum>
-  <w:abstractNum w:abstractNumId="60" w15:restartNumberingAfterBreak="0">
+  <w:abstractNum w:abstractNumId="63" w15:restartNumberingAfterBreak="0">
     <w:nsid w:val="28015C85"/>
     <w:multiLevelType w:val="multilevel"/>
     <w:tmpl w:val="28CA1692"/>
@@ -9532,7 +11100,7 @@
       </w:rPr>
     </w:lvl>
   </w:abstractNum>
-  <w:abstractNum w:abstractNumId="61" w15:restartNumberingAfterBreak="0">
+  <w:abstractNum w:abstractNumId="64" w15:restartNumberingAfterBreak="0">
     <w:nsid w:val="28BE4CAB"/>
     <w:multiLevelType w:val="multilevel"/>
     <w:tmpl w:val="DF02D368"/>
@@ -9681,7 +11249,7 @@
       </w:rPr>
     </w:lvl>
   </w:abstractNum>
-  <w:abstractNum w:abstractNumId="62" w15:restartNumberingAfterBreak="0">
+  <w:abstractNum w:abstractNumId="65" w15:restartNumberingAfterBreak="0">
     <w:nsid w:val="292076CC"/>
     <w:multiLevelType w:val="multilevel"/>
     <w:tmpl w:val="7EEED64C"/>
@@ -9830,7 +11398,7 @@
       </w:rPr>
     </w:lvl>
   </w:abstractNum>
-  <w:abstractNum w:abstractNumId="63" w15:restartNumberingAfterBreak="0">
+  <w:abstractNum w:abstractNumId="66" w15:restartNumberingAfterBreak="0">
     <w:nsid w:val="2A9E24BA"/>
     <w:multiLevelType w:val="multilevel"/>
     <w:tmpl w:val="729EA764"/>
@@ -9979,7 +11547,7 @@
       </w:rPr>
     </w:lvl>
   </w:abstractNum>
-  <w:abstractNum w:abstractNumId="64" w15:restartNumberingAfterBreak="0">
+  <w:abstractNum w:abstractNumId="67" w15:restartNumberingAfterBreak="0">
     <w:nsid w:val="2B2E4184"/>
     <w:multiLevelType w:val="multilevel"/>
     <w:tmpl w:val="470AD3F0"/>
@@ -10128,7 +11696,7 @@
       </w:rPr>
     </w:lvl>
   </w:abstractNum>
-  <w:abstractNum w:abstractNumId="65" w15:restartNumberingAfterBreak="0">
+  <w:abstractNum w:abstractNumId="68" w15:restartNumberingAfterBreak="0">
     <w:nsid w:val="2C2125DE"/>
     <w:multiLevelType w:val="multilevel"/>
     <w:tmpl w:val="F886C714"/>
@@ -10277,7 +11845,7 @@
       </w:rPr>
     </w:lvl>
   </w:abstractNum>
-  <w:abstractNum w:abstractNumId="66" w15:restartNumberingAfterBreak="0">
+  <w:abstractNum w:abstractNumId="69" w15:restartNumberingAfterBreak="0">
     <w:nsid w:val="2CC40C91"/>
     <w:multiLevelType w:val="multilevel"/>
     <w:tmpl w:val="9FE25356"/>
@@ -10426,7 +11994,7 @@
       </w:rPr>
     </w:lvl>
   </w:abstractNum>
-  <w:abstractNum w:abstractNumId="67" w15:restartNumberingAfterBreak="0">
+  <w:abstractNum w:abstractNumId="70" w15:restartNumberingAfterBreak="0">
     <w:nsid w:val="2DB07F50"/>
     <w:multiLevelType w:val="multilevel"/>
     <w:tmpl w:val="F1F6F5A2"/>
@@ -10575,7 +12143,7 @@
       </w:rPr>
     </w:lvl>
   </w:abstractNum>
-  <w:abstractNum w:abstractNumId="68" w15:restartNumberingAfterBreak="0">
+  <w:abstractNum w:abstractNumId="71" w15:restartNumberingAfterBreak="0">
     <w:nsid w:val="2EBD33C3"/>
     <w:multiLevelType w:val="multilevel"/>
     <w:tmpl w:val="D6F041C2"/>
@@ -10724,7 +12292,7 @@
       </w:rPr>
     </w:lvl>
   </w:abstractNum>
-  <w:abstractNum w:abstractNumId="69" w15:restartNumberingAfterBreak="0">
+  <w:abstractNum w:abstractNumId="72" w15:restartNumberingAfterBreak="0">
     <w:nsid w:val="2ED55960"/>
     <w:multiLevelType w:val="multilevel"/>
     <w:tmpl w:val="E7986F3A"/>
@@ -10873,7 +12441,7 @@
       </w:rPr>
     </w:lvl>
   </w:abstractNum>
-  <w:abstractNum w:abstractNumId="70" w15:restartNumberingAfterBreak="0">
+  <w:abstractNum w:abstractNumId="73" w15:restartNumberingAfterBreak="0">
     <w:nsid w:val="2ED97E26"/>
     <w:multiLevelType w:val="multilevel"/>
     <w:tmpl w:val="726C21FE"/>
@@ -11022,7 +12590,7 @@
       </w:rPr>
     </w:lvl>
   </w:abstractNum>
-  <w:abstractNum w:abstractNumId="71" w15:restartNumberingAfterBreak="0">
+  <w:abstractNum w:abstractNumId="74" w15:restartNumberingAfterBreak="0">
     <w:nsid w:val="2F8831C3"/>
     <w:multiLevelType w:val="multilevel"/>
     <w:tmpl w:val="99A84A3A"/>
@@ -11171,7 +12739,7 @@
       </w:rPr>
     </w:lvl>
   </w:abstractNum>
-  <w:abstractNum w:abstractNumId="72" w15:restartNumberingAfterBreak="0">
+  <w:abstractNum w:abstractNumId="75" w15:restartNumberingAfterBreak="0">
     <w:nsid w:val="2F9F2444"/>
     <w:multiLevelType w:val="multilevel"/>
     <w:tmpl w:val="E9981658"/>
@@ -11320,7 +12888,7 @@
       </w:rPr>
     </w:lvl>
   </w:abstractNum>
-  <w:abstractNum w:abstractNumId="73" w15:restartNumberingAfterBreak="0">
+  <w:abstractNum w:abstractNumId="76" w15:restartNumberingAfterBreak="0">
     <w:nsid w:val="3017299F"/>
     <w:multiLevelType w:val="multilevel"/>
     <w:tmpl w:val="FB8AA79C"/>
@@ -11469,7 +13037,7 @@
       </w:rPr>
     </w:lvl>
   </w:abstractNum>
-  <w:abstractNum w:abstractNumId="74" w15:restartNumberingAfterBreak="0">
+  <w:abstractNum w:abstractNumId="77" w15:restartNumberingAfterBreak="0">
     <w:nsid w:val="33103D87"/>
     <w:multiLevelType w:val="multilevel"/>
     <w:tmpl w:val="31E8D8B2"/>
@@ -11614,7 +13182,7 @@
       </w:rPr>
     </w:lvl>
   </w:abstractNum>
-  <w:abstractNum w:abstractNumId="75" w15:restartNumberingAfterBreak="0">
+  <w:abstractNum w:abstractNumId="78" w15:restartNumberingAfterBreak="0">
     <w:nsid w:val="33160BE5"/>
     <w:multiLevelType w:val="multilevel"/>
     <w:tmpl w:val="1E563DE2"/>
@@ -11763,7 +13331,7 @@
       </w:rPr>
     </w:lvl>
   </w:abstractNum>
-  <w:abstractNum w:abstractNumId="76" w15:restartNumberingAfterBreak="0">
+  <w:abstractNum w:abstractNumId="79" w15:restartNumberingAfterBreak="0">
     <w:nsid w:val="34AA27D5"/>
     <w:multiLevelType w:val="multilevel"/>
     <w:tmpl w:val="BDF4B552"/>
@@ -11876,7 +13444,7 @@
       </w:pPr>
     </w:lvl>
   </w:abstractNum>
-  <w:abstractNum w:abstractNumId="77" w15:restartNumberingAfterBreak="0">
+  <w:abstractNum w:abstractNumId="80" w15:restartNumberingAfterBreak="0">
     <w:nsid w:val="3588655B"/>
     <w:multiLevelType w:val="multilevel"/>
     <w:tmpl w:val="2B1ADC76"/>
@@ -12025,7 +13593,7 @@
       </w:rPr>
     </w:lvl>
   </w:abstractNum>
-  <w:abstractNum w:abstractNumId="78" w15:restartNumberingAfterBreak="0">
+  <w:abstractNum w:abstractNumId="81" w15:restartNumberingAfterBreak="0">
     <w:nsid w:val="35CC1611"/>
     <w:multiLevelType w:val="multilevel"/>
     <w:tmpl w:val="611278F0"/>
@@ -12174,7 +13742,7 @@
       </w:rPr>
     </w:lvl>
   </w:abstractNum>
-  <w:abstractNum w:abstractNumId="79" w15:restartNumberingAfterBreak="0">
+  <w:abstractNum w:abstractNumId="82" w15:restartNumberingAfterBreak="0">
     <w:nsid w:val="366A30C8"/>
     <w:multiLevelType w:val="multilevel"/>
     <w:tmpl w:val="5DB67266"/>
@@ -12323,7 +13891,7 @@
       </w:rPr>
     </w:lvl>
   </w:abstractNum>
-  <w:abstractNum w:abstractNumId="80" w15:restartNumberingAfterBreak="0">
+  <w:abstractNum w:abstractNumId="83" w15:restartNumberingAfterBreak="0">
     <w:nsid w:val="36B6333C"/>
     <w:multiLevelType w:val="multilevel"/>
     <w:tmpl w:val="741E1D6E"/>
@@ -12468,7 +14036,7 @@
       </w:rPr>
     </w:lvl>
   </w:abstractNum>
-  <w:abstractNum w:abstractNumId="81" w15:restartNumberingAfterBreak="0">
+  <w:abstractNum w:abstractNumId="84" w15:restartNumberingAfterBreak="0">
     <w:nsid w:val="36DA0BDE"/>
     <w:multiLevelType w:val="hybridMultilevel"/>
     <w:tmpl w:val="DDFA8490"/>
@@ -12613,7 +14181,7 @@
       </w:rPr>
     </w:lvl>
   </w:abstractNum>
-  <w:abstractNum w:abstractNumId="82" w15:restartNumberingAfterBreak="0">
+  <w:abstractNum w:abstractNumId="85" w15:restartNumberingAfterBreak="0">
     <w:nsid w:val="37654CAB"/>
     <w:multiLevelType w:val="multilevel"/>
     <w:tmpl w:val="1584B172"/>
@@ -12762,7 +14330,7 @@
       </w:rPr>
     </w:lvl>
   </w:abstractNum>
-  <w:abstractNum w:abstractNumId="83" w15:restartNumberingAfterBreak="0">
+  <w:abstractNum w:abstractNumId="86" w15:restartNumberingAfterBreak="0">
     <w:nsid w:val="37D80CF6"/>
     <w:multiLevelType w:val="multilevel"/>
     <w:tmpl w:val="C9AA1A40"/>
@@ -12907,7 +14475,7 @@
       </w:rPr>
     </w:lvl>
   </w:abstractNum>
-  <w:abstractNum w:abstractNumId="84" w15:restartNumberingAfterBreak="0">
+  <w:abstractNum w:abstractNumId="87" w15:restartNumberingAfterBreak="0">
     <w:nsid w:val="38531077"/>
     <w:multiLevelType w:val="multilevel"/>
     <w:tmpl w:val="93280230"/>
@@ -13056,7 +14624,7 @@
       </w:rPr>
     </w:lvl>
   </w:abstractNum>
-  <w:abstractNum w:abstractNumId="85" w15:restartNumberingAfterBreak="0">
+  <w:abstractNum w:abstractNumId="88" w15:restartNumberingAfterBreak="0">
     <w:nsid w:val="387D5936"/>
     <w:multiLevelType w:val="multilevel"/>
     <w:tmpl w:val="4D981682"/>
@@ -13205,7 +14773,7 @@
       </w:rPr>
     </w:lvl>
   </w:abstractNum>
-  <w:abstractNum w:abstractNumId="86" w15:restartNumberingAfterBreak="0">
+  <w:abstractNum w:abstractNumId="89" w15:restartNumberingAfterBreak="0">
     <w:nsid w:val="39193EB1"/>
     <w:multiLevelType w:val="multilevel"/>
     <w:tmpl w:val="9F923DEC"/>
@@ -13322,7 +14890,7 @@
       </w:pPr>
     </w:lvl>
   </w:abstractNum>
-  <w:abstractNum w:abstractNumId="87" w15:restartNumberingAfterBreak="0">
+  <w:abstractNum w:abstractNumId="90" w15:restartNumberingAfterBreak="0">
     <w:nsid w:val="3AD4294B"/>
     <w:multiLevelType w:val="multilevel"/>
     <w:tmpl w:val="95C89338"/>
@@ -13471,7 +15039,7 @@
       </w:rPr>
     </w:lvl>
   </w:abstractNum>
-  <w:abstractNum w:abstractNumId="88" w15:restartNumberingAfterBreak="0">
+  <w:abstractNum w:abstractNumId="91" w15:restartNumberingAfterBreak="0">
     <w:nsid w:val="3C345603"/>
     <w:multiLevelType w:val="multilevel"/>
     <w:tmpl w:val="F6DC0098"/>
@@ -13620,7 +15188,7 @@
       </w:rPr>
     </w:lvl>
   </w:abstractNum>
-  <w:abstractNum w:abstractNumId="89" w15:restartNumberingAfterBreak="0">
+  <w:abstractNum w:abstractNumId="92" w15:restartNumberingAfterBreak="0">
     <w:nsid w:val="3C6E7D9A"/>
     <w:multiLevelType w:val="multilevel"/>
     <w:tmpl w:val="B9F6A162"/>
@@ -13769,7 +15337,7 @@
       </w:rPr>
     </w:lvl>
   </w:abstractNum>
-  <w:abstractNum w:abstractNumId="90" w15:restartNumberingAfterBreak="0">
+  <w:abstractNum w:abstractNumId="93" w15:restartNumberingAfterBreak="0">
     <w:nsid w:val="3D4705C9"/>
     <w:multiLevelType w:val="multilevel"/>
     <w:tmpl w:val="3DFAEFD0"/>
@@ -13882,7 +15450,7 @@
       </w:pPr>
     </w:lvl>
   </w:abstractNum>
-  <w:abstractNum w:abstractNumId="91" w15:restartNumberingAfterBreak="0">
+  <w:abstractNum w:abstractNumId="94" w15:restartNumberingAfterBreak="0">
     <w:nsid w:val="3D4A0C1D"/>
     <w:multiLevelType w:val="multilevel"/>
     <w:tmpl w:val="E7CCFBF0"/>
@@ -14031,7 +15599,7 @@
       </w:rPr>
     </w:lvl>
   </w:abstractNum>
-  <w:abstractNum w:abstractNumId="92" w15:restartNumberingAfterBreak="0">
+  <w:abstractNum w:abstractNumId="95" w15:restartNumberingAfterBreak="0">
     <w:nsid w:val="3E1E3D22"/>
     <w:multiLevelType w:val="multilevel"/>
     <w:tmpl w:val="F508EE1A"/>
@@ -14176,7 +15744,7 @@
       </w:rPr>
     </w:lvl>
   </w:abstractNum>
-  <w:abstractNum w:abstractNumId="93" w15:restartNumberingAfterBreak="0">
+  <w:abstractNum w:abstractNumId="96" w15:restartNumberingAfterBreak="0">
     <w:nsid w:val="3E6D23BE"/>
     <w:multiLevelType w:val="multilevel"/>
     <w:tmpl w:val="F46A4AB6"/>
@@ -14325,7 +15893,7 @@
       </w:rPr>
     </w:lvl>
   </w:abstractNum>
-  <w:abstractNum w:abstractNumId="94" w15:restartNumberingAfterBreak="0">
+  <w:abstractNum w:abstractNumId="97" w15:restartNumberingAfterBreak="0">
     <w:nsid w:val="3EF34300"/>
     <w:multiLevelType w:val="multilevel"/>
     <w:tmpl w:val="44C4608E"/>
@@ -14474,7 +16042,7 @@
       </w:rPr>
     </w:lvl>
   </w:abstractNum>
-  <w:abstractNum w:abstractNumId="95" w15:restartNumberingAfterBreak="0">
+  <w:abstractNum w:abstractNumId="98" w15:restartNumberingAfterBreak="0">
     <w:nsid w:val="3F6429EF"/>
     <w:multiLevelType w:val="multilevel"/>
     <w:tmpl w:val="EE7A53EA"/>
@@ -14623,7 +16191,7 @@
       </w:rPr>
     </w:lvl>
   </w:abstractNum>
-  <w:abstractNum w:abstractNumId="96" w15:restartNumberingAfterBreak="0">
+  <w:abstractNum w:abstractNumId="99" w15:restartNumberingAfterBreak="0">
     <w:nsid w:val="3F6B35F9"/>
     <w:multiLevelType w:val="multilevel"/>
     <w:tmpl w:val="B17A18D8"/>
@@ -14772,7 +16340,7 @@
       </w:rPr>
     </w:lvl>
   </w:abstractNum>
-  <w:abstractNum w:abstractNumId="97" w15:restartNumberingAfterBreak="0">
+  <w:abstractNum w:abstractNumId="100" w15:restartNumberingAfterBreak="0">
     <w:nsid w:val="404A1DDB"/>
     <w:multiLevelType w:val="multilevel"/>
     <w:tmpl w:val="1372450C"/>
@@ -14921,7 +16489,7 @@
       </w:rPr>
     </w:lvl>
   </w:abstractNum>
-  <w:abstractNum w:abstractNumId="98" w15:restartNumberingAfterBreak="0">
+  <w:abstractNum w:abstractNumId="101" w15:restartNumberingAfterBreak="0">
     <w:nsid w:val="40FD6800"/>
     <w:multiLevelType w:val="multilevel"/>
     <w:tmpl w:val="375C2B64"/>
@@ -15070,7 +16638,7 @@
       </w:rPr>
     </w:lvl>
   </w:abstractNum>
-  <w:abstractNum w:abstractNumId="99" w15:restartNumberingAfterBreak="0">
+  <w:abstractNum w:abstractNumId="102" w15:restartNumberingAfterBreak="0">
     <w:nsid w:val="41230BE3"/>
     <w:multiLevelType w:val="multilevel"/>
     <w:tmpl w:val="6E6C8EBC"/>
@@ -15191,7 +16759,7 @@
       </w:pPr>
     </w:lvl>
   </w:abstractNum>
-  <w:abstractNum w:abstractNumId="100" w15:restartNumberingAfterBreak="0">
+  <w:abstractNum w:abstractNumId="103" w15:restartNumberingAfterBreak="0">
     <w:nsid w:val="43A431A6"/>
     <w:multiLevelType w:val="multilevel"/>
     <w:tmpl w:val="B7C4494E"/>
@@ -15340,7 +16908,7 @@
       </w:rPr>
     </w:lvl>
   </w:abstractNum>
-  <w:abstractNum w:abstractNumId="101" w15:restartNumberingAfterBreak="0">
+  <w:abstractNum w:abstractNumId="104" w15:restartNumberingAfterBreak="0">
     <w:nsid w:val="444D1127"/>
     <w:multiLevelType w:val="multilevel"/>
     <w:tmpl w:val="7BB40AD4"/>
@@ -15485,7 +17053,7 @@
       </w:rPr>
     </w:lvl>
   </w:abstractNum>
-  <w:abstractNum w:abstractNumId="102" w15:restartNumberingAfterBreak="0">
+  <w:abstractNum w:abstractNumId="105" w15:restartNumberingAfterBreak="0">
     <w:nsid w:val="448720CB"/>
     <w:multiLevelType w:val="multilevel"/>
     <w:tmpl w:val="8AA67A0A"/>
@@ -15634,7 +17202,7 @@
       </w:rPr>
     </w:lvl>
   </w:abstractNum>
-  <w:abstractNum w:abstractNumId="103" w15:restartNumberingAfterBreak="0">
+  <w:abstractNum w:abstractNumId="106" w15:restartNumberingAfterBreak="0">
     <w:nsid w:val="457010D0"/>
     <w:multiLevelType w:val="multilevel"/>
     <w:tmpl w:val="7D8029F2"/>
@@ -15783,7 +17351,7 @@
       </w:rPr>
     </w:lvl>
   </w:abstractNum>
-  <w:abstractNum w:abstractNumId="104" w15:restartNumberingAfterBreak="0">
+  <w:abstractNum w:abstractNumId="107" w15:restartNumberingAfterBreak="0">
     <w:nsid w:val="45DD61A9"/>
     <w:multiLevelType w:val="multilevel"/>
     <w:tmpl w:val="B886828E"/>
@@ -15900,7 +17468,7 @@
       </w:pPr>
     </w:lvl>
   </w:abstractNum>
-  <w:abstractNum w:abstractNumId="105" w15:restartNumberingAfterBreak="0">
+  <w:abstractNum w:abstractNumId="108" w15:restartNumberingAfterBreak="0">
     <w:nsid w:val="464F19D3"/>
     <w:multiLevelType w:val="multilevel"/>
     <w:tmpl w:val="BC323D78"/>
@@ -16049,7 +17617,7 @@
       </w:rPr>
     </w:lvl>
   </w:abstractNum>
-  <w:abstractNum w:abstractNumId="106" w15:restartNumberingAfterBreak="0">
+  <w:abstractNum w:abstractNumId="109" w15:restartNumberingAfterBreak="0">
     <w:nsid w:val="46F27205"/>
     <w:multiLevelType w:val="multilevel"/>
     <w:tmpl w:val="0AFCE1BC"/>
@@ -16198,7 +17766,7 @@
       </w:rPr>
     </w:lvl>
   </w:abstractNum>
-  <w:abstractNum w:abstractNumId="107" w15:restartNumberingAfterBreak="0">
+  <w:abstractNum w:abstractNumId="110" w15:restartNumberingAfterBreak="0">
     <w:nsid w:val="47832412"/>
     <w:multiLevelType w:val="multilevel"/>
     <w:tmpl w:val="F3943DF8"/>
@@ -16311,7 +17879,7 @@
       </w:pPr>
     </w:lvl>
   </w:abstractNum>
-  <w:abstractNum w:abstractNumId="108" w15:restartNumberingAfterBreak="0">
+  <w:abstractNum w:abstractNumId="111" w15:restartNumberingAfterBreak="0">
     <w:nsid w:val="480D5336"/>
     <w:multiLevelType w:val="multilevel"/>
     <w:tmpl w:val="18B66C58"/>
@@ -16460,7 +18028,7 @@
       </w:rPr>
     </w:lvl>
   </w:abstractNum>
-  <w:abstractNum w:abstractNumId="109" w15:restartNumberingAfterBreak="0">
+  <w:abstractNum w:abstractNumId="112" w15:restartNumberingAfterBreak="0">
     <w:nsid w:val="48DF4AE5"/>
     <w:multiLevelType w:val="multilevel"/>
     <w:tmpl w:val="D2ACBF36"/>
@@ -16605,7 +18173,7 @@
       </w:rPr>
     </w:lvl>
   </w:abstractNum>
-  <w:abstractNum w:abstractNumId="110" w15:restartNumberingAfterBreak="0">
+  <w:abstractNum w:abstractNumId="113" w15:restartNumberingAfterBreak="0">
     <w:nsid w:val="49674015"/>
     <w:multiLevelType w:val="multilevel"/>
     <w:tmpl w:val="5CDA808A"/>
@@ -16754,7 +18322,7 @@
       </w:rPr>
     </w:lvl>
   </w:abstractNum>
-  <w:abstractNum w:abstractNumId="111" w15:restartNumberingAfterBreak="0">
+  <w:abstractNum w:abstractNumId="114" w15:restartNumberingAfterBreak="0">
     <w:nsid w:val="4B775943"/>
     <w:multiLevelType w:val="multilevel"/>
     <w:tmpl w:val="4822909E"/>
@@ -16903,7 +18471,7 @@
       </w:rPr>
     </w:lvl>
   </w:abstractNum>
-  <w:abstractNum w:abstractNumId="112" w15:restartNumberingAfterBreak="0">
+  <w:abstractNum w:abstractNumId="115" w15:restartNumberingAfterBreak="0">
     <w:nsid w:val="4C4C44DB"/>
     <w:multiLevelType w:val="multilevel"/>
     <w:tmpl w:val="A2B6B3AC"/>
@@ -17052,7 +18620,7 @@
       </w:rPr>
     </w:lvl>
   </w:abstractNum>
-  <w:abstractNum w:abstractNumId="113" w15:restartNumberingAfterBreak="0">
+  <w:abstractNum w:abstractNumId="116" w15:restartNumberingAfterBreak="0">
     <w:nsid w:val="4CF45F14"/>
     <w:multiLevelType w:val="multilevel"/>
     <w:tmpl w:val="8E8888EA"/>
@@ -17201,7 +18769,7 @@
       </w:rPr>
     </w:lvl>
   </w:abstractNum>
-  <w:abstractNum w:abstractNumId="114" w15:restartNumberingAfterBreak="0">
+  <w:abstractNum w:abstractNumId="117" w15:restartNumberingAfterBreak="0">
     <w:nsid w:val="4D062C1F"/>
     <w:multiLevelType w:val="multilevel"/>
     <w:tmpl w:val="A726E1D8"/>
@@ -17346,7 +18914,7 @@
       </w:rPr>
     </w:lvl>
   </w:abstractNum>
-  <w:abstractNum w:abstractNumId="115" w15:restartNumberingAfterBreak="0">
+  <w:abstractNum w:abstractNumId="118" w15:restartNumberingAfterBreak="0">
     <w:nsid w:val="4D6B4459"/>
     <w:multiLevelType w:val="multilevel"/>
     <w:tmpl w:val="990C0B00"/>
@@ -17495,7 +19063,7 @@
       </w:rPr>
     </w:lvl>
   </w:abstractNum>
-  <w:abstractNum w:abstractNumId="116" w15:restartNumberingAfterBreak="0">
+  <w:abstractNum w:abstractNumId="119" w15:restartNumberingAfterBreak="0">
     <w:nsid w:val="4EF43154"/>
     <w:multiLevelType w:val="multilevel"/>
     <w:tmpl w:val="2B50E070"/>
@@ -17644,7 +19212,7 @@
       </w:rPr>
     </w:lvl>
   </w:abstractNum>
-  <w:abstractNum w:abstractNumId="117" w15:restartNumberingAfterBreak="0">
+  <w:abstractNum w:abstractNumId="120" w15:restartNumberingAfterBreak="0">
     <w:nsid w:val="4F012EF7"/>
     <w:multiLevelType w:val="multilevel"/>
     <w:tmpl w:val="D256C35E"/>
@@ -17793,7 +19361,7 @@
       </w:rPr>
     </w:lvl>
   </w:abstractNum>
-  <w:abstractNum w:abstractNumId="118" w15:restartNumberingAfterBreak="0">
+  <w:abstractNum w:abstractNumId="121" w15:restartNumberingAfterBreak="0">
     <w:nsid w:val="4F692CB6"/>
     <w:multiLevelType w:val="multilevel"/>
     <w:tmpl w:val="08B460C6"/>
@@ -17914,7 +19482,7 @@
       </w:pPr>
     </w:lvl>
   </w:abstractNum>
-  <w:abstractNum w:abstractNumId="119" w15:restartNumberingAfterBreak="0">
+  <w:abstractNum w:abstractNumId="122" w15:restartNumberingAfterBreak="0">
     <w:nsid w:val="4F6E0069"/>
     <w:multiLevelType w:val="multilevel"/>
     <w:tmpl w:val="F412E96C"/>
@@ -18027,7 +19595,7 @@
       </w:pPr>
     </w:lvl>
   </w:abstractNum>
-  <w:abstractNum w:abstractNumId="120" w15:restartNumberingAfterBreak="0">
+  <w:abstractNum w:abstractNumId="123" w15:restartNumberingAfterBreak="0">
     <w:nsid w:val="4F7E6B05"/>
     <w:multiLevelType w:val="multilevel"/>
     <w:tmpl w:val="E37EF7A4"/>
@@ -18176,7 +19744,7 @@
       </w:rPr>
     </w:lvl>
   </w:abstractNum>
-  <w:abstractNum w:abstractNumId="121" w15:restartNumberingAfterBreak="0">
+  <w:abstractNum w:abstractNumId="124" w15:restartNumberingAfterBreak="0">
     <w:nsid w:val="50C4484A"/>
     <w:multiLevelType w:val="multilevel"/>
     <w:tmpl w:val="129406DA"/>
@@ -18325,7 +19893,7 @@
       </w:rPr>
     </w:lvl>
   </w:abstractNum>
-  <w:abstractNum w:abstractNumId="122" w15:restartNumberingAfterBreak="0">
+  <w:abstractNum w:abstractNumId="125" w15:restartNumberingAfterBreak="0">
     <w:nsid w:val="52B0679E"/>
     <w:multiLevelType w:val="multilevel"/>
     <w:tmpl w:val="BAA0FE20"/>
@@ -18474,7 +20042,7 @@
       </w:rPr>
     </w:lvl>
   </w:abstractNum>
-  <w:abstractNum w:abstractNumId="123" w15:restartNumberingAfterBreak="0">
+  <w:abstractNum w:abstractNumId="126" w15:restartNumberingAfterBreak="0">
     <w:nsid w:val="52CA5321"/>
     <w:multiLevelType w:val="multilevel"/>
     <w:tmpl w:val="A5789A90"/>
@@ -18623,7 +20191,7 @@
       </w:rPr>
     </w:lvl>
   </w:abstractNum>
-  <w:abstractNum w:abstractNumId="124" w15:restartNumberingAfterBreak="0">
+  <w:abstractNum w:abstractNumId="127" w15:restartNumberingAfterBreak="0">
     <w:nsid w:val="54934925"/>
     <w:multiLevelType w:val="multilevel"/>
     <w:tmpl w:val="98CC5222"/>
@@ -18768,7 +20336,7 @@
       </w:rPr>
     </w:lvl>
   </w:abstractNum>
-  <w:abstractNum w:abstractNumId="125" w15:restartNumberingAfterBreak="0">
+  <w:abstractNum w:abstractNumId="128" w15:restartNumberingAfterBreak="0">
     <w:nsid w:val="563E4D2B"/>
     <w:multiLevelType w:val="multilevel"/>
     <w:tmpl w:val="858CF264"/>
@@ -18917,7 +20485,7 @@
       </w:rPr>
     </w:lvl>
   </w:abstractNum>
-  <w:abstractNum w:abstractNumId="126" w15:restartNumberingAfterBreak="0">
+  <w:abstractNum w:abstractNumId="129" w15:restartNumberingAfterBreak="0">
     <w:nsid w:val="56577CA2"/>
     <w:multiLevelType w:val="multilevel"/>
     <w:tmpl w:val="3B464D96"/>
@@ -19066,7 +20634,7 @@
       </w:rPr>
     </w:lvl>
   </w:abstractNum>
-  <w:abstractNum w:abstractNumId="127" w15:restartNumberingAfterBreak="0">
+  <w:abstractNum w:abstractNumId="130" w15:restartNumberingAfterBreak="0">
     <w:nsid w:val="569559BD"/>
     <w:multiLevelType w:val="multilevel"/>
     <w:tmpl w:val="C5ACF636"/>
@@ -19211,7 +20779,7 @@
       </w:rPr>
     </w:lvl>
   </w:abstractNum>
-  <w:abstractNum w:abstractNumId="128" w15:restartNumberingAfterBreak="0">
+  <w:abstractNum w:abstractNumId="131" w15:restartNumberingAfterBreak="0">
     <w:nsid w:val="58337005"/>
     <w:multiLevelType w:val="multilevel"/>
     <w:tmpl w:val="67BE8296"/>
@@ -19360,7 +20928,7 @@
       </w:rPr>
     </w:lvl>
   </w:abstractNum>
-  <w:abstractNum w:abstractNumId="129" w15:restartNumberingAfterBreak="0">
+  <w:abstractNum w:abstractNumId="132" w15:restartNumberingAfterBreak="0">
     <w:nsid w:val="5860109E"/>
     <w:multiLevelType w:val="multilevel"/>
     <w:tmpl w:val="3E7EC0DA"/>
@@ -19473,7 +21041,7 @@
       </w:pPr>
     </w:lvl>
   </w:abstractNum>
-  <w:abstractNum w:abstractNumId="130" w15:restartNumberingAfterBreak="0">
+  <w:abstractNum w:abstractNumId="133" w15:restartNumberingAfterBreak="0">
     <w:nsid w:val="588A7022"/>
     <w:multiLevelType w:val="multilevel"/>
     <w:tmpl w:val="209098E6"/>
@@ -19618,7 +21186,7 @@
       </w:rPr>
     </w:lvl>
   </w:abstractNum>
-  <w:abstractNum w:abstractNumId="131" w15:restartNumberingAfterBreak="0">
+  <w:abstractNum w:abstractNumId="134" w15:restartNumberingAfterBreak="0">
     <w:nsid w:val="59D6380F"/>
     <w:multiLevelType w:val="multilevel"/>
     <w:tmpl w:val="CCEAB946"/>
@@ -19767,7 +21335,7 @@
       </w:rPr>
     </w:lvl>
   </w:abstractNum>
-  <w:abstractNum w:abstractNumId="132" w15:restartNumberingAfterBreak="0">
+  <w:abstractNum w:abstractNumId="135" w15:restartNumberingAfterBreak="0">
     <w:nsid w:val="59EA2A05"/>
     <w:multiLevelType w:val="multilevel"/>
     <w:tmpl w:val="7B1C58E2"/>
@@ -19916,7 +21484,7 @@
       </w:rPr>
     </w:lvl>
   </w:abstractNum>
-  <w:abstractNum w:abstractNumId="133" w15:restartNumberingAfterBreak="0">
+  <w:abstractNum w:abstractNumId="136" w15:restartNumberingAfterBreak="0">
     <w:nsid w:val="5A1E6C22"/>
     <w:multiLevelType w:val="multilevel"/>
     <w:tmpl w:val="4C5A959C"/>
@@ -20065,7 +21633,7 @@
       </w:rPr>
     </w:lvl>
   </w:abstractNum>
-  <w:abstractNum w:abstractNumId="134" w15:restartNumberingAfterBreak="0">
+  <w:abstractNum w:abstractNumId="137" w15:restartNumberingAfterBreak="0">
     <w:nsid w:val="5A967845"/>
     <w:multiLevelType w:val="multilevel"/>
     <w:tmpl w:val="671291B0"/>
@@ -20214,7 +21782,7 @@
       </w:rPr>
     </w:lvl>
   </w:abstractNum>
-  <w:abstractNum w:abstractNumId="135" w15:restartNumberingAfterBreak="0">
+  <w:abstractNum w:abstractNumId="138" w15:restartNumberingAfterBreak="0">
     <w:nsid w:val="5AF5226D"/>
     <w:multiLevelType w:val="multilevel"/>
     <w:tmpl w:val="B99AC694"/>
@@ -20327,7 +21895,7 @@
       </w:pPr>
     </w:lvl>
   </w:abstractNum>
-  <w:abstractNum w:abstractNumId="136" w15:restartNumberingAfterBreak="0">
+  <w:abstractNum w:abstractNumId="139" w15:restartNumberingAfterBreak="0">
     <w:nsid w:val="5AF5307D"/>
     <w:multiLevelType w:val="multilevel"/>
     <w:tmpl w:val="E8A4830C"/>
@@ -20476,7 +22044,7 @@
       </w:rPr>
     </w:lvl>
   </w:abstractNum>
-  <w:abstractNum w:abstractNumId="137" w15:restartNumberingAfterBreak="0">
+  <w:abstractNum w:abstractNumId="140" w15:restartNumberingAfterBreak="0">
     <w:nsid w:val="5BEC45E3"/>
     <w:multiLevelType w:val="multilevel"/>
     <w:tmpl w:val="BFEEBEA6"/>
@@ -20621,7 +22189,7 @@
       </w:rPr>
     </w:lvl>
   </w:abstractNum>
-  <w:abstractNum w:abstractNumId="138" w15:restartNumberingAfterBreak="0">
+  <w:abstractNum w:abstractNumId="141" w15:restartNumberingAfterBreak="0">
     <w:nsid w:val="5C351A04"/>
     <w:multiLevelType w:val="multilevel"/>
     <w:tmpl w:val="A454A842"/>
@@ -20766,7 +22334,7 @@
       </w:rPr>
     </w:lvl>
   </w:abstractNum>
-  <w:abstractNum w:abstractNumId="139" w15:restartNumberingAfterBreak="0">
+  <w:abstractNum w:abstractNumId="142" w15:restartNumberingAfterBreak="0">
     <w:nsid w:val="5C875E9E"/>
     <w:multiLevelType w:val="multilevel"/>
     <w:tmpl w:val="1E50267A"/>
@@ -20915,7 +22483,7 @@
       </w:rPr>
     </w:lvl>
   </w:abstractNum>
-  <w:abstractNum w:abstractNumId="140" w15:restartNumberingAfterBreak="0">
+  <w:abstractNum w:abstractNumId="143" w15:restartNumberingAfterBreak="0">
     <w:nsid w:val="5EB92979"/>
     <w:multiLevelType w:val="multilevel"/>
     <w:tmpl w:val="6596B810"/>
@@ -21064,7 +22632,7 @@
       </w:rPr>
     </w:lvl>
   </w:abstractNum>
-  <w:abstractNum w:abstractNumId="141" w15:restartNumberingAfterBreak="0">
+  <w:abstractNum w:abstractNumId="144" w15:restartNumberingAfterBreak="0">
     <w:nsid w:val="5EE830EE"/>
     <w:multiLevelType w:val="multilevel"/>
     <w:tmpl w:val="94A28B36"/>
@@ -21209,7 +22777,7 @@
       </w:rPr>
     </w:lvl>
   </w:abstractNum>
-  <w:abstractNum w:abstractNumId="142" w15:restartNumberingAfterBreak="0">
+  <w:abstractNum w:abstractNumId="145" w15:restartNumberingAfterBreak="0">
     <w:nsid w:val="5F115C9A"/>
     <w:multiLevelType w:val="multilevel"/>
     <w:tmpl w:val="9F6429B0"/>
@@ -21322,7 +22890,7 @@
       </w:pPr>
     </w:lvl>
   </w:abstractNum>
-  <w:abstractNum w:abstractNumId="143" w15:restartNumberingAfterBreak="0">
+  <w:abstractNum w:abstractNumId="146" w15:restartNumberingAfterBreak="0">
     <w:nsid w:val="5F697C42"/>
     <w:multiLevelType w:val="multilevel"/>
     <w:tmpl w:val="9DC4083C"/>
@@ -21471,7 +23039,7 @@
       </w:rPr>
     </w:lvl>
   </w:abstractNum>
-  <w:abstractNum w:abstractNumId="144" w15:restartNumberingAfterBreak="0">
+  <w:abstractNum w:abstractNumId="147" w15:restartNumberingAfterBreak="0">
     <w:nsid w:val="60F905B2"/>
     <w:multiLevelType w:val="multilevel"/>
     <w:tmpl w:val="67242AE0"/>
@@ -21620,7 +23188,7 @@
       </w:rPr>
     </w:lvl>
   </w:abstractNum>
-  <w:abstractNum w:abstractNumId="145" w15:restartNumberingAfterBreak="0">
+  <w:abstractNum w:abstractNumId="148" w15:restartNumberingAfterBreak="0">
     <w:nsid w:val="612E77DC"/>
     <w:multiLevelType w:val="multilevel"/>
     <w:tmpl w:val="022496D4"/>
@@ -21769,7 +23337,7 @@
       </w:rPr>
     </w:lvl>
   </w:abstractNum>
-  <w:abstractNum w:abstractNumId="146" w15:restartNumberingAfterBreak="0">
+  <w:abstractNum w:abstractNumId="149" w15:restartNumberingAfterBreak="0">
     <w:nsid w:val="63CF35A4"/>
     <w:multiLevelType w:val="multilevel"/>
     <w:tmpl w:val="1B76D1E2"/>
@@ -21886,7 +23454,7 @@
       </w:pPr>
     </w:lvl>
   </w:abstractNum>
-  <w:abstractNum w:abstractNumId="147" w15:restartNumberingAfterBreak="0">
+  <w:abstractNum w:abstractNumId="150" w15:restartNumberingAfterBreak="0">
     <w:nsid w:val="6542530D"/>
     <w:multiLevelType w:val="multilevel"/>
     <w:tmpl w:val="E4CE3122"/>
@@ -22035,7 +23603,7 @@
       </w:rPr>
     </w:lvl>
   </w:abstractNum>
-  <w:abstractNum w:abstractNumId="148" w15:restartNumberingAfterBreak="0">
+  <w:abstractNum w:abstractNumId="151" w15:restartNumberingAfterBreak="0">
     <w:nsid w:val="67712178"/>
     <w:multiLevelType w:val="multilevel"/>
     <w:tmpl w:val="763E8398"/>
@@ -22180,7 +23748,7 @@
       </w:rPr>
     </w:lvl>
   </w:abstractNum>
-  <w:abstractNum w:abstractNumId="149" w15:restartNumberingAfterBreak="0">
+  <w:abstractNum w:abstractNumId="152" w15:restartNumberingAfterBreak="0">
     <w:nsid w:val="67FE3CF3"/>
     <w:multiLevelType w:val="multilevel"/>
     <w:tmpl w:val="F0EA03EE"/>
@@ -22329,7 +23897,7 @@
       </w:rPr>
     </w:lvl>
   </w:abstractNum>
-  <w:abstractNum w:abstractNumId="150" w15:restartNumberingAfterBreak="0">
+  <w:abstractNum w:abstractNumId="153" w15:restartNumberingAfterBreak="0">
     <w:nsid w:val="68346FCA"/>
     <w:multiLevelType w:val="multilevel"/>
     <w:tmpl w:val="F5624ABA"/>
@@ -22478,7 +24046,7 @@
       </w:rPr>
     </w:lvl>
   </w:abstractNum>
-  <w:abstractNum w:abstractNumId="151" w15:restartNumberingAfterBreak="0">
+  <w:abstractNum w:abstractNumId="154" w15:restartNumberingAfterBreak="0">
     <w:nsid w:val="684D1C7E"/>
     <w:multiLevelType w:val="multilevel"/>
     <w:tmpl w:val="8C26FD92"/>
@@ -22627,7 +24195,7 @@
       </w:rPr>
     </w:lvl>
   </w:abstractNum>
-  <w:abstractNum w:abstractNumId="152" w15:restartNumberingAfterBreak="0">
+  <w:abstractNum w:abstractNumId="155" w15:restartNumberingAfterBreak="0">
     <w:nsid w:val="691B7355"/>
     <w:multiLevelType w:val="multilevel"/>
     <w:tmpl w:val="8988CDE0"/>
@@ -22772,7 +24340,7 @@
       </w:rPr>
     </w:lvl>
   </w:abstractNum>
-  <w:abstractNum w:abstractNumId="153" w15:restartNumberingAfterBreak="0">
+  <w:abstractNum w:abstractNumId="156" w15:restartNumberingAfterBreak="0">
     <w:nsid w:val="69B8059F"/>
     <w:multiLevelType w:val="multilevel"/>
     <w:tmpl w:val="9AC2858C"/>
@@ -22921,7 +24489,7 @@
       </w:rPr>
     </w:lvl>
   </w:abstractNum>
-  <w:abstractNum w:abstractNumId="154" w15:restartNumberingAfterBreak="0">
+  <w:abstractNum w:abstractNumId="157" w15:restartNumberingAfterBreak="0">
     <w:nsid w:val="6AD65718"/>
     <w:multiLevelType w:val="multilevel"/>
     <w:tmpl w:val="FCAC18C2"/>
@@ -23070,7 +24638,305 @@
       </w:rPr>
     </w:lvl>
   </w:abstractNum>
-  <w:abstractNum w:abstractNumId="155" w15:restartNumberingAfterBreak="0">
+  <w:abstractNum w:abstractNumId="158" w15:restartNumberingAfterBreak="0">
+    <w:nsid w:val="6B6417EA"/>
+    <w:multiLevelType w:val="multilevel"/>
+    <w:tmpl w:val="26E6A2DE"/>
+    <w:lvl w:ilvl="0">
+      <w:start w:val="1"/>
+      <w:numFmt w:val="bullet"/>
+      <w:lvlText w:val=""/>
+      <w:lvlJc w:val="left"/>
+      <w:pPr>
+        <w:tabs>
+          <w:tab w:val="num" w:pos="720"/>
+        </w:tabs>
+        <w:ind w:left="720" w:hanging="360"/>
+      </w:pPr>
+      <w:rPr>
+        <w:rFonts w:ascii="Symbol" w:hAnsi="Symbol" w:hint="default"/>
+        <w:sz w:val="20"/>
+      </w:rPr>
+    </w:lvl>
+    <w:lvl w:ilvl="1" w:tentative="1">
+      <w:start w:val="1"/>
+      <w:numFmt w:val="bullet"/>
+      <w:lvlText w:val="o"/>
+      <w:lvlJc w:val="left"/>
+      <w:pPr>
+        <w:tabs>
+          <w:tab w:val="num" w:pos="1440"/>
+        </w:tabs>
+        <w:ind w:left="1440" w:hanging="360"/>
+      </w:pPr>
+      <w:rPr>
+        <w:rFonts w:ascii="Courier New" w:hAnsi="Courier New" w:hint="default"/>
+        <w:sz w:val="20"/>
+      </w:rPr>
+    </w:lvl>
+    <w:lvl w:ilvl="2" w:tentative="1">
+      <w:start w:val="1"/>
+      <w:numFmt w:val="bullet"/>
+      <w:lvlText w:val=""/>
+      <w:lvlJc w:val="left"/>
+      <w:pPr>
+        <w:tabs>
+          <w:tab w:val="num" w:pos="2160"/>
+        </w:tabs>
+        <w:ind w:left="2160" w:hanging="360"/>
+      </w:pPr>
+      <w:rPr>
+        <w:rFonts w:ascii="Wingdings" w:hAnsi="Wingdings" w:hint="default"/>
+        <w:sz w:val="20"/>
+      </w:rPr>
+    </w:lvl>
+    <w:lvl w:ilvl="3" w:tentative="1">
+      <w:start w:val="1"/>
+      <w:numFmt w:val="bullet"/>
+      <w:lvlText w:val=""/>
+      <w:lvlJc w:val="left"/>
+      <w:pPr>
+        <w:tabs>
+          <w:tab w:val="num" w:pos="2880"/>
+        </w:tabs>
+        <w:ind w:left="2880" w:hanging="360"/>
+      </w:pPr>
+      <w:rPr>
+        <w:rFonts w:ascii="Wingdings" w:hAnsi="Wingdings" w:hint="default"/>
+        <w:sz w:val="20"/>
+      </w:rPr>
+    </w:lvl>
+    <w:lvl w:ilvl="4" w:tentative="1">
+      <w:start w:val="1"/>
+      <w:numFmt w:val="bullet"/>
+      <w:lvlText w:val=""/>
+      <w:lvlJc w:val="left"/>
+      <w:pPr>
+        <w:tabs>
+          <w:tab w:val="num" w:pos="3600"/>
+        </w:tabs>
+        <w:ind w:left="3600" w:hanging="360"/>
+      </w:pPr>
+      <w:rPr>
+        <w:rFonts w:ascii="Wingdings" w:hAnsi="Wingdings" w:hint="default"/>
+        <w:sz w:val="20"/>
+      </w:rPr>
+    </w:lvl>
+    <w:lvl w:ilvl="5" w:tentative="1">
+      <w:start w:val="1"/>
+      <w:numFmt w:val="bullet"/>
+      <w:lvlText w:val=""/>
+      <w:lvlJc w:val="left"/>
+      <w:pPr>
+        <w:tabs>
+          <w:tab w:val="num" w:pos="4320"/>
+        </w:tabs>
+        <w:ind w:left="4320" w:hanging="360"/>
+      </w:pPr>
+      <w:rPr>
+        <w:rFonts w:ascii="Wingdings" w:hAnsi="Wingdings" w:hint="default"/>
+        <w:sz w:val="20"/>
+      </w:rPr>
+    </w:lvl>
+    <w:lvl w:ilvl="6" w:tentative="1">
+      <w:start w:val="1"/>
+      <w:numFmt w:val="bullet"/>
+      <w:lvlText w:val=""/>
+      <w:lvlJc w:val="left"/>
+      <w:pPr>
+        <w:tabs>
+          <w:tab w:val="num" w:pos="5040"/>
+        </w:tabs>
+        <w:ind w:left="5040" w:hanging="360"/>
+      </w:pPr>
+      <w:rPr>
+        <w:rFonts w:ascii="Wingdings" w:hAnsi="Wingdings" w:hint="default"/>
+        <w:sz w:val="20"/>
+      </w:rPr>
+    </w:lvl>
+    <w:lvl w:ilvl="7" w:tentative="1">
+      <w:start w:val="1"/>
+      <w:numFmt w:val="bullet"/>
+      <w:lvlText w:val=""/>
+      <w:lvlJc w:val="left"/>
+      <w:pPr>
+        <w:tabs>
+          <w:tab w:val="num" w:pos="5760"/>
+        </w:tabs>
+        <w:ind w:left="5760" w:hanging="360"/>
+      </w:pPr>
+      <w:rPr>
+        <w:rFonts w:ascii="Wingdings" w:hAnsi="Wingdings" w:hint="default"/>
+        <w:sz w:val="20"/>
+      </w:rPr>
+    </w:lvl>
+    <w:lvl w:ilvl="8" w:tentative="1">
+      <w:start w:val="1"/>
+      <w:numFmt w:val="bullet"/>
+      <w:lvlText w:val=""/>
+      <w:lvlJc w:val="left"/>
+      <w:pPr>
+        <w:tabs>
+          <w:tab w:val="num" w:pos="6480"/>
+        </w:tabs>
+        <w:ind w:left="6480" w:hanging="360"/>
+      </w:pPr>
+      <w:rPr>
+        <w:rFonts w:ascii="Wingdings" w:hAnsi="Wingdings" w:hint="default"/>
+        <w:sz w:val="20"/>
+      </w:rPr>
+    </w:lvl>
+  </w:abstractNum>
+  <w:abstractNum w:abstractNumId="159" w15:restartNumberingAfterBreak="0">
+    <w:nsid w:val="6B783215"/>
+    <w:multiLevelType w:val="multilevel"/>
+    <w:tmpl w:val="188C22AA"/>
+    <w:lvl w:ilvl="0">
+      <w:start w:val="1"/>
+      <w:numFmt w:val="bullet"/>
+      <w:lvlText w:val=""/>
+      <w:lvlJc w:val="left"/>
+      <w:pPr>
+        <w:tabs>
+          <w:tab w:val="num" w:pos="720"/>
+        </w:tabs>
+        <w:ind w:left="720" w:hanging="360"/>
+      </w:pPr>
+      <w:rPr>
+        <w:rFonts w:ascii="Symbol" w:hAnsi="Symbol" w:hint="default"/>
+        <w:sz w:val="20"/>
+      </w:rPr>
+    </w:lvl>
+    <w:lvl w:ilvl="1" w:tentative="1">
+      <w:start w:val="1"/>
+      <w:numFmt w:val="bullet"/>
+      <w:lvlText w:val="o"/>
+      <w:lvlJc w:val="left"/>
+      <w:pPr>
+        <w:tabs>
+          <w:tab w:val="num" w:pos="1440"/>
+        </w:tabs>
+        <w:ind w:left="1440" w:hanging="360"/>
+      </w:pPr>
+      <w:rPr>
+        <w:rFonts w:ascii="Courier New" w:hAnsi="Courier New" w:hint="default"/>
+        <w:sz w:val="20"/>
+      </w:rPr>
+    </w:lvl>
+    <w:lvl w:ilvl="2" w:tentative="1">
+      <w:start w:val="1"/>
+      <w:numFmt w:val="bullet"/>
+      <w:lvlText w:val=""/>
+      <w:lvlJc w:val="left"/>
+      <w:pPr>
+        <w:tabs>
+          <w:tab w:val="num" w:pos="2160"/>
+        </w:tabs>
+        <w:ind w:left="2160" w:hanging="360"/>
+      </w:pPr>
+      <w:rPr>
+        <w:rFonts w:ascii="Wingdings" w:hAnsi="Wingdings" w:hint="default"/>
+        <w:sz w:val="20"/>
+      </w:rPr>
+    </w:lvl>
+    <w:lvl w:ilvl="3" w:tentative="1">
+      <w:start w:val="1"/>
+      <w:numFmt w:val="bullet"/>
+      <w:lvlText w:val=""/>
+      <w:lvlJc w:val="left"/>
+      <w:pPr>
+        <w:tabs>
+          <w:tab w:val="num" w:pos="2880"/>
+        </w:tabs>
+        <w:ind w:left="2880" w:hanging="360"/>
+      </w:pPr>
+      <w:rPr>
+        <w:rFonts w:ascii="Wingdings" w:hAnsi="Wingdings" w:hint="default"/>
+        <w:sz w:val="20"/>
+      </w:rPr>
+    </w:lvl>
+    <w:lvl w:ilvl="4" w:tentative="1">
+      <w:start w:val="1"/>
+      <w:numFmt w:val="bullet"/>
+      <w:lvlText w:val=""/>
+      <w:lvlJc w:val="left"/>
+      <w:pPr>
+        <w:tabs>
+          <w:tab w:val="num" w:pos="3600"/>
+        </w:tabs>
+        <w:ind w:left="3600" w:hanging="360"/>
+      </w:pPr>
+      <w:rPr>
+        <w:rFonts w:ascii="Wingdings" w:hAnsi="Wingdings" w:hint="default"/>
+        <w:sz w:val="20"/>
+      </w:rPr>
+    </w:lvl>
+    <w:lvl w:ilvl="5" w:tentative="1">
+      <w:start w:val="1"/>
+      <w:numFmt w:val="bullet"/>
+      <w:lvlText w:val=""/>
+      <w:lvlJc w:val="left"/>
+      <w:pPr>
+        <w:tabs>
+          <w:tab w:val="num" w:pos="4320"/>
+        </w:tabs>
+        <w:ind w:left="4320" w:hanging="360"/>
+      </w:pPr>
+      <w:rPr>
+        <w:rFonts w:ascii="Wingdings" w:hAnsi="Wingdings" w:hint="default"/>
+        <w:sz w:val="20"/>
+      </w:rPr>
+    </w:lvl>
+    <w:lvl w:ilvl="6" w:tentative="1">
+      <w:start w:val="1"/>
+      <w:numFmt w:val="bullet"/>
+      <w:lvlText w:val=""/>
+      <w:lvlJc w:val="left"/>
+      <w:pPr>
+        <w:tabs>
+          <w:tab w:val="num" w:pos="5040"/>
+        </w:tabs>
+        <w:ind w:left="5040" w:hanging="360"/>
+      </w:pPr>
+      <w:rPr>
+        <w:rFonts w:ascii="Wingdings" w:hAnsi="Wingdings" w:hint="default"/>
+        <w:sz w:val="20"/>
+      </w:rPr>
+    </w:lvl>
+    <w:lvl w:ilvl="7" w:tentative="1">
+      <w:start w:val="1"/>
+      <w:numFmt w:val="bullet"/>
+      <w:lvlText w:val=""/>
+      <w:lvlJc w:val="left"/>
+      <w:pPr>
+        <w:tabs>
+          <w:tab w:val="num" w:pos="5760"/>
+        </w:tabs>
+        <w:ind w:left="5760" w:hanging="360"/>
+      </w:pPr>
+      <w:rPr>
+        <w:rFonts w:ascii="Wingdings" w:hAnsi="Wingdings" w:hint="default"/>
+        <w:sz w:val="20"/>
+      </w:rPr>
+    </w:lvl>
+    <w:lvl w:ilvl="8" w:tentative="1">
+      <w:start w:val="1"/>
+      <w:numFmt w:val="bullet"/>
+      <w:lvlText w:val=""/>
+      <w:lvlJc w:val="left"/>
+      <w:pPr>
+        <w:tabs>
+          <w:tab w:val="num" w:pos="6480"/>
+        </w:tabs>
+        <w:ind w:left="6480" w:hanging="360"/>
+      </w:pPr>
+      <w:rPr>
+        <w:rFonts w:ascii="Wingdings" w:hAnsi="Wingdings" w:hint="default"/>
+        <w:sz w:val="20"/>
+      </w:rPr>
+    </w:lvl>
+  </w:abstractNum>
+  <w:abstractNum w:abstractNumId="160" w15:restartNumberingAfterBreak="0">
     <w:nsid w:val="6B8A6220"/>
     <w:multiLevelType w:val="multilevel"/>
     <w:tmpl w:val="5C163B7A"/>
@@ -23183,7 +25049,7 @@
       </w:pPr>
     </w:lvl>
   </w:abstractNum>
-  <w:abstractNum w:abstractNumId="156" w15:restartNumberingAfterBreak="0">
+  <w:abstractNum w:abstractNumId="161" w15:restartNumberingAfterBreak="0">
     <w:nsid w:val="6BD06AC3"/>
     <w:multiLevelType w:val="multilevel"/>
     <w:tmpl w:val="0E88B312"/>
@@ -23328,7 +25194,7 @@
       </w:rPr>
     </w:lvl>
   </w:abstractNum>
-  <w:abstractNum w:abstractNumId="157" w15:restartNumberingAfterBreak="0">
+  <w:abstractNum w:abstractNumId="162" w15:restartNumberingAfterBreak="0">
     <w:nsid w:val="6BEB67DB"/>
     <w:multiLevelType w:val="multilevel"/>
     <w:tmpl w:val="35F42B3E"/>
@@ -23477,7 +25343,7 @@
       </w:rPr>
     </w:lvl>
   </w:abstractNum>
-  <w:abstractNum w:abstractNumId="158" w15:restartNumberingAfterBreak="0">
+  <w:abstractNum w:abstractNumId="163" w15:restartNumberingAfterBreak="0">
     <w:nsid w:val="6C233DA4"/>
     <w:multiLevelType w:val="multilevel"/>
     <w:tmpl w:val="D88290E8"/>
@@ -23626,7 +25492,7 @@
       </w:rPr>
     </w:lvl>
   </w:abstractNum>
-  <w:abstractNum w:abstractNumId="159" w15:restartNumberingAfterBreak="0">
+  <w:abstractNum w:abstractNumId="164" w15:restartNumberingAfterBreak="0">
     <w:nsid w:val="6CA96557"/>
     <w:multiLevelType w:val="multilevel"/>
     <w:tmpl w:val="1CEE2CF0"/>
@@ -23775,7 +25641,7 @@
       </w:rPr>
     </w:lvl>
   </w:abstractNum>
-  <w:abstractNum w:abstractNumId="160" w15:restartNumberingAfterBreak="0">
+  <w:abstractNum w:abstractNumId="165" w15:restartNumberingAfterBreak="0">
     <w:nsid w:val="6DD97F7B"/>
     <w:multiLevelType w:val="multilevel"/>
     <w:tmpl w:val="AC8ACFF4"/>
@@ -23924,7 +25790,7 @@
       </w:rPr>
     </w:lvl>
   </w:abstractNum>
-  <w:abstractNum w:abstractNumId="161" w15:restartNumberingAfterBreak="0">
+  <w:abstractNum w:abstractNumId="166" w15:restartNumberingAfterBreak="0">
     <w:nsid w:val="6DF23E49"/>
     <w:multiLevelType w:val="multilevel"/>
     <w:tmpl w:val="6BCA895E"/>
@@ -24037,7 +25903,7 @@
       </w:pPr>
     </w:lvl>
   </w:abstractNum>
-  <w:abstractNum w:abstractNumId="162" w15:restartNumberingAfterBreak="0">
+  <w:abstractNum w:abstractNumId="167" w15:restartNumberingAfterBreak="0">
     <w:nsid w:val="6EF20D1C"/>
     <w:multiLevelType w:val="multilevel"/>
     <w:tmpl w:val="5086AF3C"/>
@@ -24186,7 +26052,7 @@
       </w:rPr>
     </w:lvl>
   </w:abstractNum>
-  <w:abstractNum w:abstractNumId="163" w15:restartNumberingAfterBreak="0">
+  <w:abstractNum w:abstractNumId="168" w15:restartNumberingAfterBreak="0">
     <w:nsid w:val="6F4F03C4"/>
     <w:multiLevelType w:val="multilevel"/>
     <w:tmpl w:val="274291C6"/>
@@ -24335,7 +26201,7 @@
       </w:rPr>
     </w:lvl>
   </w:abstractNum>
-  <w:abstractNum w:abstractNumId="164" w15:restartNumberingAfterBreak="0">
+  <w:abstractNum w:abstractNumId="169" w15:restartNumberingAfterBreak="0">
     <w:nsid w:val="6FD342C0"/>
     <w:multiLevelType w:val="multilevel"/>
     <w:tmpl w:val="187C8E1A"/>
@@ -24484,7 +26350,7 @@
       </w:rPr>
     </w:lvl>
   </w:abstractNum>
-  <w:abstractNum w:abstractNumId="165" w15:restartNumberingAfterBreak="0">
+  <w:abstractNum w:abstractNumId="170" w15:restartNumberingAfterBreak="0">
     <w:nsid w:val="706F1B6B"/>
     <w:multiLevelType w:val="multilevel"/>
     <w:tmpl w:val="371EF16A"/>
@@ -24633,7 +26499,7 @@
       </w:rPr>
     </w:lvl>
   </w:abstractNum>
-  <w:abstractNum w:abstractNumId="166" w15:restartNumberingAfterBreak="0">
+  <w:abstractNum w:abstractNumId="171" w15:restartNumberingAfterBreak="0">
     <w:nsid w:val="70901095"/>
     <w:multiLevelType w:val="multilevel"/>
     <w:tmpl w:val="C66CA5E8"/>
@@ -24782,7 +26648,7 @@
       </w:rPr>
     </w:lvl>
   </w:abstractNum>
-  <w:abstractNum w:abstractNumId="167" w15:restartNumberingAfterBreak="0">
+  <w:abstractNum w:abstractNumId="172" w15:restartNumberingAfterBreak="0">
     <w:nsid w:val="70D86182"/>
     <w:multiLevelType w:val="multilevel"/>
     <w:tmpl w:val="02387014"/>
@@ -24931,7 +26797,7 @@
       </w:rPr>
     </w:lvl>
   </w:abstractNum>
-  <w:abstractNum w:abstractNumId="168" w15:restartNumberingAfterBreak="0">
+  <w:abstractNum w:abstractNumId="173" w15:restartNumberingAfterBreak="0">
     <w:nsid w:val="71D37AAF"/>
     <w:multiLevelType w:val="multilevel"/>
     <w:tmpl w:val="B2B200B6"/>
@@ -25048,7 +26914,7 @@
       </w:pPr>
     </w:lvl>
   </w:abstractNum>
-  <w:abstractNum w:abstractNumId="169" w15:restartNumberingAfterBreak="0">
+  <w:abstractNum w:abstractNumId="174" w15:restartNumberingAfterBreak="0">
     <w:nsid w:val="722A05EF"/>
     <w:multiLevelType w:val="multilevel"/>
     <w:tmpl w:val="9D4017A0"/>
@@ -25193,7 +27059,7 @@
       </w:rPr>
     </w:lvl>
   </w:abstractNum>
-  <w:abstractNum w:abstractNumId="170" w15:restartNumberingAfterBreak="0">
+  <w:abstractNum w:abstractNumId="175" w15:restartNumberingAfterBreak="0">
     <w:nsid w:val="75657497"/>
     <w:multiLevelType w:val="multilevel"/>
     <w:tmpl w:val="10B8BB48"/>
@@ -25342,7 +27208,156 @@
       </w:rPr>
     </w:lvl>
   </w:abstractNum>
-  <w:abstractNum w:abstractNumId="171" w15:restartNumberingAfterBreak="0">
+  <w:abstractNum w:abstractNumId="176" w15:restartNumberingAfterBreak="0">
+    <w:nsid w:val="77193D02"/>
+    <w:multiLevelType w:val="multilevel"/>
+    <w:tmpl w:val="8388940C"/>
+    <w:lvl w:ilvl="0">
+      <w:start w:val="1"/>
+      <w:numFmt w:val="bullet"/>
+      <w:lvlText w:val=""/>
+      <w:lvlJc w:val="left"/>
+      <w:pPr>
+        <w:tabs>
+          <w:tab w:val="num" w:pos="720"/>
+        </w:tabs>
+        <w:ind w:left="720" w:hanging="360"/>
+      </w:pPr>
+      <w:rPr>
+        <w:rFonts w:ascii="Symbol" w:hAnsi="Symbol" w:hint="default"/>
+        <w:sz w:val="20"/>
+      </w:rPr>
+    </w:lvl>
+    <w:lvl w:ilvl="1">
+      <w:start w:val="1"/>
+      <w:numFmt w:val="bullet"/>
+      <w:lvlText w:val="o"/>
+      <w:lvlJc w:val="left"/>
+      <w:pPr>
+        <w:tabs>
+          <w:tab w:val="num" w:pos="1440"/>
+        </w:tabs>
+        <w:ind w:left="1440" w:hanging="360"/>
+      </w:pPr>
+      <w:rPr>
+        <w:rFonts w:ascii="Courier New" w:hAnsi="Courier New" w:hint="default"/>
+        <w:sz w:val="20"/>
+      </w:rPr>
+    </w:lvl>
+    <w:lvl w:ilvl="2" w:tentative="1">
+      <w:start w:val="1"/>
+      <w:numFmt w:val="bullet"/>
+      <w:lvlText w:val=""/>
+      <w:lvlJc w:val="left"/>
+      <w:pPr>
+        <w:tabs>
+          <w:tab w:val="num" w:pos="2160"/>
+        </w:tabs>
+        <w:ind w:left="2160" w:hanging="360"/>
+      </w:pPr>
+      <w:rPr>
+        <w:rFonts w:ascii="Wingdings" w:hAnsi="Wingdings" w:hint="default"/>
+        <w:sz w:val="20"/>
+      </w:rPr>
+    </w:lvl>
+    <w:lvl w:ilvl="3" w:tentative="1">
+      <w:start w:val="1"/>
+      <w:numFmt w:val="bullet"/>
+      <w:lvlText w:val=""/>
+      <w:lvlJc w:val="left"/>
+      <w:pPr>
+        <w:tabs>
+          <w:tab w:val="num" w:pos="2880"/>
+        </w:tabs>
+        <w:ind w:left="2880" w:hanging="360"/>
+      </w:pPr>
+      <w:rPr>
+        <w:rFonts w:ascii="Wingdings" w:hAnsi="Wingdings" w:hint="default"/>
+        <w:sz w:val="20"/>
+      </w:rPr>
+    </w:lvl>
+    <w:lvl w:ilvl="4" w:tentative="1">
+      <w:start w:val="1"/>
+      <w:numFmt w:val="bullet"/>
+      <w:lvlText w:val=""/>
+      <w:lvlJc w:val="left"/>
+      <w:pPr>
+        <w:tabs>
+          <w:tab w:val="num" w:pos="3600"/>
+        </w:tabs>
+        <w:ind w:left="3600" w:hanging="360"/>
+      </w:pPr>
+      <w:rPr>
+        <w:rFonts w:ascii="Wingdings" w:hAnsi="Wingdings" w:hint="default"/>
+        <w:sz w:val="20"/>
+      </w:rPr>
+    </w:lvl>
+    <w:lvl w:ilvl="5" w:tentative="1">
+      <w:start w:val="1"/>
+      <w:numFmt w:val="bullet"/>
+      <w:lvlText w:val=""/>
+      <w:lvlJc w:val="left"/>
+      <w:pPr>
+        <w:tabs>
+          <w:tab w:val="num" w:pos="4320"/>
+        </w:tabs>
+        <w:ind w:left="4320" w:hanging="360"/>
+      </w:pPr>
+      <w:rPr>
+        <w:rFonts w:ascii="Wingdings" w:hAnsi="Wingdings" w:hint="default"/>
+        <w:sz w:val="20"/>
+      </w:rPr>
+    </w:lvl>
+    <w:lvl w:ilvl="6" w:tentative="1">
+      <w:start w:val="1"/>
+      <w:numFmt w:val="bullet"/>
+      <w:lvlText w:val=""/>
+      <w:lvlJc w:val="left"/>
+      <w:pPr>
+        <w:tabs>
+          <w:tab w:val="num" w:pos="5040"/>
+        </w:tabs>
+        <w:ind w:left="5040" w:hanging="360"/>
+      </w:pPr>
+      <w:rPr>
+        <w:rFonts w:ascii="Wingdings" w:hAnsi="Wingdings" w:hint="default"/>
+        <w:sz w:val="20"/>
+      </w:rPr>
+    </w:lvl>
+    <w:lvl w:ilvl="7" w:tentative="1">
+      <w:start w:val="1"/>
+      <w:numFmt w:val="bullet"/>
+      <w:lvlText w:val=""/>
+      <w:lvlJc w:val="left"/>
+      <w:pPr>
+        <w:tabs>
+          <w:tab w:val="num" w:pos="5760"/>
+        </w:tabs>
+        <w:ind w:left="5760" w:hanging="360"/>
+      </w:pPr>
+      <w:rPr>
+        <w:rFonts w:ascii="Wingdings" w:hAnsi="Wingdings" w:hint="default"/>
+        <w:sz w:val="20"/>
+      </w:rPr>
+    </w:lvl>
+    <w:lvl w:ilvl="8" w:tentative="1">
+      <w:start w:val="1"/>
+      <w:numFmt w:val="bullet"/>
+      <w:lvlText w:val=""/>
+      <w:lvlJc w:val="left"/>
+      <w:pPr>
+        <w:tabs>
+          <w:tab w:val="num" w:pos="6480"/>
+        </w:tabs>
+        <w:ind w:left="6480" w:hanging="360"/>
+      </w:pPr>
+      <w:rPr>
+        <w:rFonts w:ascii="Wingdings" w:hAnsi="Wingdings" w:hint="default"/>
+        <w:sz w:val="20"/>
+      </w:rPr>
+    </w:lvl>
+  </w:abstractNum>
+  <w:abstractNum w:abstractNumId="177" w15:restartNumberingAfterBreak="0">
     <w:nsid w:val="7784607C"/>
     <w:multiLevelType w:val="multilevel"/>
     <w:tmpl w:val="605C0276"/>
@@ -25491,7 +27506,7 @@
       </w:rPr>
     </w:lvl>
   </w:abstractNum>
-  <w:abstractNum w:abstractNumId="172" w15:restartNumberingAfterBreak="0">
+  <w:abstractNum w:abstractNumId="178" w15:restartNumberingAfterBreak="0">
     <w:nsid w:val="780A6F3B"/>
     <w:multiLevelType w:val="multilevel"/>
     <w:tmpl w:val="19DEA0B6"/>
@@ -25640,7 +27655,7 @@
       </w:rPr>
     </w:lvl>
   </w:abstractNum>
-  <w:abstractNum w:abstractNumId="173" w15:restartNumberingAfterBreak="0">
+  <w:abstractNum w:abstractNumId="179" w15:restartNumberingAfterBreak="0">
     <w:nsid w:val="78A22134"/>
     <w:multiLevelType w:val="multilevel"/>
     <w:tmpl w:val="073E2A9E"/>
@@ -25789,7 +27804,7 @@
       </w:rPr>
     </w:lvl>
   </w:abstractNum>
-  <w:abstractNum w:abstractNumId="174" w15:restartNumberingAfterBreak="0">
+  <w:abstractNum w:abstractNumId="180" w15:restartNumberingAfterBreak="0">
     <w:nsid w:val="78FC2D90"/>
     <w:multiLevelType w:val="multilevel"/>
     <w:tmpl w:val="318E98EC"/>
@@ -25938,7 +27953,7 @@
       </w:rPr>
     </w:lvl>
   </w:abstractNum>
-  <w:abstractNum w:abstractNumId="175" w15:restartNumberingAfterBreak="0">
+  <w:abstractNum w:abstractNumId="181" w15:restartNumberingAfterBreak="0">
     <w:nsid w:val="7B5E061D"/>
     <w:multiLevelType w:val="multilevel"/>
     <w:tmpl w:val="680E5C16"/>
@@ -26087,7 +28102,7 @@
       </w:rPr>
     </w:lvl>
   </w:abstractNum>
-  <w:abstractNum w:abstractNumId="176" w15:restartNumberingAfterBreak="0">
+  <w:abstractNum w:abstractNumId="182" w15:restartNumberingAfterBreak="0">
     <w:nsid w:val="7BFA798B"/>
     <w:multiLevelType w:val="multilevel"/>
     <w:tmpl w:val="552CDCDA"/>
@@ -26236,7 +28251,7 @@
       </w:rPr>
     </w:lvl>
   </w:abstractNum>
-  <w:abstractNum w:abstractNumId="177" w15:restartNumberingAfterBreak="0">
+  <w:abstractNum w:abstractNumId="183" w15:restartNumberingAfterBreak="0">
     <w:nsid w:val="7D242EAD"/>
     <w:multiLevelType w:val="multilevel"/>
     <w:tmpl w:val="B16ADB76"/>
@@ -26381,7 +28396,7 @@
       </w:rPr>
     </w:lvl>
   </w:abstractNum>
-  <w:abstractNum w:abstractNumId="178" w15:restartNumberingAfterBreak="0">
+  <w:abstractNum w:abstractNumId="184" w15:restartNumberingAfterBreak="0">
     <w:nsid w:val="7E5315A9"/>
     <w:multiLevelType w:val="multilevel"/>
     <w:tmpl w:val="63760288"/>
@@ -26498,7 +28513,7 @@
       </w:pPr>
     </w:lvl>
   </w:abstractNum>
-  <w:abstractNum w:abstractNumId="179" w15:restartNumberingAfterBreak="0">
+  <w:abstractNum w:abstractNumId="185" w15:restartNumberingAfterBreak="0">
     <w:nsid w:val="7E845D03"/>
     <w:multiLevelType w:val="multilevel"/>
     <w:tmpl w:val="22FA3D84"/>
@@ -26647,7 +28662,7 @@
       </w:rPr>
     </w:lvl>
   </w:abstractNum>
-  <w:abstractNum w:abstractNumId="180" w15:restartNumberingAfterBreak="0">
+  <w:abstractNum w:abstractNumId="186" w15:restartNumberingAfterBreak="0">
     <w:nsid w:val="7F9A1358"/>
     <w:multiLevelType w:val="multilevel"/>
     <w:tmpl w:val="818C7948"/>
@@ -26761,85 +28776,85 @@
     </w:lvl>
   </w:abstractNum>
   <w:num w:numId="1" w16cid:durableId="30304640">
-    <w:abstractNumId w:val="133"/>
+    <w:abstractNumId w:val="136"/>
   </w:num>
   <w:num w:numId="2" w16cid:durableId="131679990">
-    <w:abstractNumId w:val="40"/>
+    <w:abstractNumId w:val="42"/>
   </w:num>
   <w:num w:numId="3" w16cid:durableId="1523083221">
-    <w:abstractNumId w:val="90"/>
+    <w:abstractNumId w:val="93"/>
   </w:num>
   <w:num w:numId="4" w16cid:durableId="956788891">
-    <w:abstractNumId w:val="112"/>
+    <w:abstractNumId w:val="115"/>
   </w:num>
   <w:num w:numId="5" w16cid:durableId="1318801211">
+    <w:abstractNumId w:val="99"/>
+  </w:num>
+  <w:num w:numId="6" w16cid:durableId="1068186247">
     <w:abstractNumId w:val="96"/>
   </w:num>
-  <w:num w:numId="6" w16cid:durableId="1068186247">
-    <w:abstractNumId w:val="93"/>
-  </w:num>
   <w:num w:numId="7" w16cid:durableId="1380788396">
-    <w:abstractNumId w:val="105"/>
+    <w:abstractNumId w:val="108"/>
   </w:num>
   <w:num w:numId="8" w16cid:durableId="1435594655">
     <w:abstractNumId w:val="8"/>
   </w:num>
   <w:num w:numId="9" w16cid:durableId="468284279">
-    <w:abstractNumId w:val="173"/>
+    <w:abstractNumId w:val="179"/>
   </w:num>
   <w:num w:numId="10" w16cid:durableId="1801537932">
-    <w:abstractNumId w:val="171"/>
+    <w:abstractNumId w:val="177"/>
   </w:num>
   <w:num w:numId="11" w16cid:durableId="1292319018">
-    <w:abstractNumId w:val="119"/>
+    <w:abstractNumId w:val="122"/>
   </w:num>
   <w:num w:numId="12" w16cid:durableId="1330595449">
-    <w:abstractNumId w:val="117"/>
+    <w:abstractNumId w:val="120"/>
   </w:num>
   <w:num w:numId="13" w16cid:durableId="1978413072">
-    <w:abstractNumId w:val="109"/>
+    <w:abstractNumId w:val="112"/>
   </w:num>
   <w:num w:numId="14" w16cid:durableId="806052255">
-    <w:abstractNumId w:val="161"/>
+    <w:abstractNumId w:val="166"/>
   </w:num>
   <w:num w:numId="15" w16cid:durableId="2104833335">
-    <w:abstractNumId w:val="165"/>
+    <w:abstractNumId w:val="170"/>
   </w:num>
   <w:num w:numId="16" w16cid:durableId="36244815">
-    <w:abstractNumId w:val="88"/>
+    <w:abstractNumId w:val="91"/>
   </w:num>
   <w:num w:numId="17" w16cid:durableId="1400398143">
-    <w:abstractNumId w:val="107"/>
+    <w:abstractNumId w:val="110"/>
   </w:num>
   <w:num w:numId="18" w16cid:durableId="773331749">
-    <w:abstractNumId w:val="179"/>
+    <w:abstractNumId w:val="185"/>
   </w:num>
   <w:num w:numId="19" w16cid:durableId="791021393">
-    <w:abstractNumId w:val="49"/>
+    <w:abstractNumId w:val="51"/>
   </w:num>
   <w:num w:numId="20" w16cid:durableId="1022052027">
     <w:abstractNumId w:val="2"/>
   </w:num>
   <w:num w:numId="21" w16cid:durableId="1709253564">
-    <w:abstractNumId w:val="57"/>
+    <w:abstractNumId w:val="60"/>
   </w:num>
   <w:num w:numId="22" w16cid:durableId="191111326">
-    <w:abstractNumId w:val="64"/>
+    <w:abstractNumId w:val="67"/>
   </w:num>
   <w:num w:numId="23" w16cid:durableId="1067648228">
     <w:abstractNumId w:val="10"/>
   </w:num>
   <w:num w:numId="24" w16cid:durableId="561647625">
-    <w:abstractNumId w:val="141"/>
+    <w:abstractNumId w:val="144"/>
   </w:num>
   <w:num w:numId="25" w16cid:durableId="602147053">
-    <w:abstractNumId w:val="146"/>
+    <w:abstractNumId w:val="149"/>
   </w:num>
   <w:num w:numId="26" w16cid:durableId="645671251">
-    <w:abstractNumId w:val="48"/>
+    <w:abstractNumId w:val="50"/>
   </w:num>
   <w:num w:numId="27" w16cid:durableId="347103321">
-    <w:abstractNumId w:val="48"/>
+    <w:abstractNumId w:val="50"/>
     <w:lvlOverride w:ilvl="1">
       <w:lvl w:ilvl="1">
         <w:numFmt w:val="decimal"/>
@@ -26849,16 +28864,16 @@
     </w:lvlOverride>
   </w:num>
   <w:num w:numId="28" w16cid:durableId="2012875563">
-    <w:abstractNumId w:val="136"/>
+    <w:abstractNumId w:val="139"/>
   </w:num>
   <w:num w:numId="29" w16cid:durableId="428089704">
-    <w:abstractNumId w:val="34"/>
+    <w:abstractNumId w:val="35"/>
   </w:num>
   <w:num w:numId="30" w16cid:durableId="410931569">
-    <w:abstractNumId w:val="130"/>
+    <w:abstractNumId w:val="133"/>
   </w:num>
   <w:num w:numId="31" w16cid:durableId="819882765">
-    <w:abstractNumId w:val="130"/>
+    <w:abstractNumId w:val="133"/>
     <w:lvlOverride w:ilvl="1">
       <w:lvl w:ilvl="1">
         <w:numFmt w:val="bullet"/>
@@ -26878,22 +28893,22 @@
     </w:lvlOverride>
   </w:num>
   <w:num w:numId="32" w16cid:durableId="1979919899">
-    <w:abstractNumId w:val="140"/>
+    <w:abstractNumId w:val="143"/>
   </w:num>
   <w:num w:numId="33" w16cid:durableId="650063522">
-    <w:abstractNumId w:val="160"/>
+    <w:abstractNumId w:val="165"/>
   </w:num>
   <w:num w:numId="34" w16cid:durableId="1829176748">
-    <w:abstractNumId w:val="85"/>
+    <w:abstractNumId w:val="88"/>
   </w:num>
   <w:num w:numId="35" w16cid:durableId="599877971">
-    <w:abstractNumId w:val="154"/>
+    <w:abstractNumId w:val="157"/>
   </w:num>
   <w:num w:numId="36" w16cid:durableId="1571841508">
-    <w:abstractNumId w:val="74"/>
+    <w:abstractNumId w:val="77"/>
   </w:num>
   <w:num w:numId="37" w16cid:durableId="391195595">
-    <w:abstractNumId w:val="74"/>
+    <w:abstractNumId w:val="77"/>
     <w:lvlOverride w:ilvl="1">
       <w:lvl w:ilvl="1">
         <w:numFmt w:val="bullet"/>
@@ -26913,19 +28928,19 @@
     </w:lvlOverride>
   </w:num>
   <w:num w:numId="38" w16cid:durableId="919680886">
-    <w:abstractNumId w:val="124"/>
+    <w:abstractNumId w:val="127"/>
   </w:num>
   <w:num w:numId="39" w16cid:durableId="1682001463">
+    <w:abstractNumId w:val="156"/>
+  </w:num>
+  <w:num w:numId="40" w16cid:durableId="175849549">
     <w:abstractNumId w:val="153"/>
   </w:num>
-  <w:num w:numId="40" w16cid:durableId="175849549">
-    <w:abstractNumId w:val="150"/>
-  </w:num>
   <w:num w:numId="41" w16cid:durableId="1617180450">
-    <w:abstractNumId w:val="101"/>
+    <w:abstractNumId w:val="104"/>
   </w:num>
   <w:num w:numId="42" w16cid:durableId="361367430">
-    <w:abstractNumId w:val="101"/>
+    <w:abstractNumId w:val="104"/>
     <w:lvlOverride w:ilvl="1">
       <w:lvl w:ilvl="1">
         <w:numFmt w:val="bullet"/>
@@ -26945,22 +28960,22 @@
     </w:lvlOverride>
   </w:num>
   <w:num w:numId="43" w16cid:durableId="1042828563">
-    <w:abstractNumId w:val="72"/>
+    <w:abstractNumId w:val="75"/>
   </w:num>
   <w:num w:numId="44" w16cid:durableId="1097871696">
     <w:abstractNumId w:val="14"/>
   </w:num>
   <w:num w:numId="45" w16cid:durableId="71661480">
-    <w:abstractNumId w:val="31"/>
+    <w:abstractNumId w:val="32"/>
   </w:num>
   <w:num w:numId="46" w16cid:durableId="938682825">
-    <w:abstractNumId w:val="70"/>
+    <w:abstractNumId w:val="73"/>
   </w:num>
   <w:num w:numId="47" w16cid:durableId="2360494">
-    <w:abstractNumId w:val="92"/>
+    <w:abstractNumId w:val="95"/>
   </w:num>
   <w:num w:numId="48" w16cid:durableId="1462654371">
-    <w:abstractNumId w:val="92"/>
+    <w:abstractNumId w:val="95"/>
     <w:lvlOverride w:ilvl="1">
       <w:lvl w:ilvl="1">
         <w:numFmt w:val="bullet"/>
@@ -26983,22 +28998,22 @@
     <w:abstractNumId w:val="7"/>
   </w:num>
   <w:num w:numId="50" w16cid:durableId="1930918386">
-    <w:abstractNumId w:val="113"/>
+    <w:abstractNumId w:val="116"/>
   </w:num>
   <w:num w:numId="51" w16cid:durableId="209197328">
-    <w:abstractNumId w:val="127"/>
+    <w:abstractNumId w:val="130"/>
   </w:num>
   <w:num w:numId="52" w16cid:durableId="697435575">
-    <w:abstractNumId w:val="102"/>
+    <w:abstractNumId w:val="105"/>
   </w:num>
   <w:num w:numId="53" w16cid:durableId="582766624">
-    <w:abstractNumId w:val="175"/>
+    <w:abstractNumId w:val="181"/>
   </w:num>
   <w:num w:numId="54" w16cid:durableId="830023098">
-    <w:abstractNumId w:val="80"/>
+    <w:abstractNumId w:val="83"/>
   </w:num>
   <w:num w:numId="55" w16cid:durableId="2100523153">
-    <w:abstractNumId w:val="80"/>
+    <w:abstractNumId w:val="83"/>
     <w:lvlOverride w:ilvl="2">
       <w:lvl w:ilvl="2">
         <w:numFmt w:val="bullet"/>
@@ -27018,25 +29033,25 @@
     </w:lvlOverride>
   </w:num>
   <w:num w:numId="56" w16cid:durableId="2020885991">
+    <w:abstractNumId w:val="64"/>
+  </w:num>
+  <w:num w:numId="57" w16cid:durableId="1606956943">
+    <w:abstractNumId w:val="163"/>
+  </w:num>
+  <w:num w:numId="58" w16cid:durableId="1840383666">
+    <w:abstractNumId w:val="62"/>
+  </w:num>
+  <w:num w:numId="59" w16cid:durableId="1892301501">
+    <w:abstractNumId w:val="34"/>
+  </w:num>
+  <w:num w:numId="60" w16cid:durableId="836503678">
     <w:abstractNumId w:val="61"/>
   </w:num>
-  <w:num w:numId="57" w16cid:durableId="1606956943">
-    <w:abstractNumId w:val="158"/>
-  </w:num>
-  <w:num w:numId="58" w16cid:durableId="1840383666">
-    <w:abstractNumId w:val="59"/>
-  </w:num>
-  <w:num w:numId="59" w16cid:durableId="1892301501">
-    <w:abstractNumId w:val="33"/>
-  </w:num>
-  <w:num w:numId="60" w16cid:durableId="836503678">
-    <w:abstractNumId w:val="58"/>
-  </w:num>
   <w:num w:numId="61" w16cid:durableId="779489446">
-    <w:abstractNumId w:val="157"/>
+    <w:abstractNumId w:val="162"/>
   </w:num>
   <w:num w:numId="62" w16cid:durableId="2096628128">
-    <w:abstractNumId w:val="164"/>
+    <w:abstractNumId w:val="169"/>
   </w:num>
   <w:num w:numId="63" w16cid:durableId="1257978311">
     <w:abstractNumId w:val="12"/>
@@ -27048,19 +29063,19 @@
     </w:lvlOverride>
   </w:num>
   <w:num w:numId="65" w16cid:durableId="217672684">
-    <w:abstractNumId w:val="63"/>
+    <w:abstractNumId w:val="66"/>
   </w:num>
   <w:num w:numId="66" w16cid:durableId="1697807086">
-    <w:abstractNumId w:val="142"/>
+    <w:abstractNumId w:val="145"/>
   </w:num>
   <w:num w:numId="67" w16cid:durableId="1418672027">
-    <w:abstractNumId w:val="106"/>
+    <w:abstractNumId w:val="109"/>
   </w:num>
   <w:num w:numId="68" w16cid:durableId="91168919">
-    <w:abstractNumId w:val="54"/>
+    <w:abstractNumId w:val="56"/>
   </w:num>
   <w:num w:numId="69" w16cid:durableId="2116288939">
-    <w:abstractNumId w:val="54"/>
+    <w:abstractNumId w:val="56"/>
     <w:lvlOverride w:ilvl="1">
       <w:lvl w:ilvl="1">
         <w:numFmt w:val="bullet"/>
@@ -27080,19 +29095,19 @@
     </w:lvlOverride>
   </w:num>
   <w:num w:numId="70" w16cid:durableId="366217262">
-    <w:abstractNumId w:val="35"/>
+    <w:abstractNumId w:val="36"/>
   </w:num>
   <w:num w:numId="71" w16cid:durableId="1231965884">
     <w:abstractNumId w:val="16"/>
   </w:num>
   <w:num w:numId="72" w16cid:durableId="1766876056">
-    <w:abstractNumId w:val="135"/>
+    <w:abstractNumId w:val="138"/>
   </w:num>
   <w:num w:numId="73" w16cid:durableId="929197985">
-    <w:abstractNumId w:val="156"/>
+    <w:abstractNumId w:val="161"/>
   </w:num>
   <w:num w:numId="74" w16cid:durableId="406078978">
-    <w:abstractNumId w:val="156"/>
+    <w:abstractNumId w:val="161"/>
     <w:lvlOverride w:ilvl="1">
       <w:lvl w:ilvl="1">
         <w:numFmt w:val="bullet"/>
@@ -27112,7 +29127,7 @@
     </w:lvlOverride>
   </w:num>
   <w:num w:numId="75" w16cid:durableId="1260987308">
-    <w:abstractNumId w:val="156"/>
+    <w:abstractNumId w:val="161"/>
     <w:lvlOverride w:ilvl="1">
       <w:lvl w:ilvl="1">
         <w:numFmt w:val="bullet"/>
@@ -27132,25 +29147,25 @@
     </w:lvlOverride>
   </w:num>
   <w:num w:numId="76" w16cid:durableId="533739789">
-    <w:abstractNumId w:val="79"/>
+    <w:abstractNumId w:val="82"/>
   </w:num>
   <w:num w:numId="77" w16cid:durableId="526450885">
-    <w:abstractNumId w:val="144"/>
+    <w:abstractNumId w:val="147"/>
   </w:num>
   <w:num w:numId="78" w16cid:durableId="1324964506">
-    <w:abstractNumId w:val="51"/>
+    <w:abstractNumId w:val="53"/>
   </w:num>
   <w:num w:numId="79" w16cid:durableId="1432968174">
-    <w:abstractNumId w:val="37"/>
+    <w:abstractNumId w:val="38"/>
   </w:num>
   <w:num w:numId="80" w16cid:durableId="739714761">
-    <w:abstractNumId w:val="39"/>
+    <w:abstractNumId w:val="41"/>
   </w:num>
   <w:num w:numId="81" w16cid:durableId="745693035">
-    <w:abstractNumId w:val="52"/>
+    <w:abstractNumId w:val="54"/>
   </w:num>
   <w:num w:numId="82" w16cid:durableId="1045986169">
-    <w:abstractNumId w:val="52"/>
+    <w:abstractNumId w:val="54"/>
     <w:lvlOverride w:ilvl="1">
       <w:lvl w:ilvl="1">
         <w:numFmt w:val="decimal"/>
@@ -27160,7 +29175,7 @@
     </w:lvlOverride>
   </w:num>
   <w:num w:numId="83" w16cid:durableId="2044592980">
-    <w:abstractNumId w:val="86"/>
+    <w:abstractNumId w:val="89"/>
   </w:num>
   <w:num w:numId="84" w16cid:durableId="1940676223">
     <w:abstractNumId w:val="4"/>
@@ -27169,19 +29184,19 @@
     <w:abstractNumId w:val="5"/>
   </w:num>
   <w:num w:numId="86" w16cid:durableId="1431199121">
-    <w:abstractNumId w:val="43"/>
+    <w:abstractNumId w:val="45"/>
   </w:num>
   <w:num w:numId="87" w16cid:durableId="482088748">
-    <w:abstractNumId w:val="84"/>
+    <w:abstractNumId w:val="87"/>
   </w:num>
   <w:num w:numId="88" w16cid:durableId="2067410442">
-    <w:abstractNumId w:val="67"/>
+    <w:abstractNumId w:val="70"/>
   </w:num>
   <w:num w:numId="89" w16cid:durableId="327559367">
-    <w:abstractNumId w:val="121"/>
+    <w:abstractNumId w:val="124"/>
   </w:num>
   <w:num w:numId="90" w16cid:durableId="41368198">
-    <w:abstractNumId w:val="42"/>
+    <w:abstractNumId w:val="44"/>
   </w:num>
   <w:num w:numId="91" w16cid:durableId="805393976">
     <w:abstractNumId w:val="15"/>
@@ -27230,91 +29245,91 @@
     <w:abstractNumId w:val="22"/>
   </w:num>
   <w:num w:numId="95" w16cid:durableId="665595090">
-    <w:abstractNumId w:val="81"/>
+    <w:abstractNumId w:val="84"/>
   </w:num>
   <w:num w:numId="96" w16cid:durableId="1303005290">
-    <w:abstractNumId w:val="75"/>
+    <w:abstractNumId w:val="78"/>
   </w:num>
   <w:num w:numId="97" w16cid:durableId="1213418878">
-    <w:abstractNumId w:val="110"/>
+    <w:abstractNumId w:val="113"/>
   </w:num>
   <w:num w:numId="98" w16cid:durableId="1310596252">
-    <w:abstractNumId w:val="169"/>
+    <w:abstractNumId w:val="174"/>
   </w:num>
   <w:num w:numId="99" w16cid:durableId="1261528361">
-    <w:abstractNumId w:val="66"/>
+    <w:abstractNumId w:val="69"/>
   </w:num>
   <w:num w:numId="100" w16cid:durableId="1837305605">
-    <w:abstractNumId w:val="65"/>
+    <w:abstractNumId w:val="68"/>
   </w:num>
   <w:num w:numId="101" w16cid:durableId="1037898143">
-    <w:abstractNumId w:val="134"/>
+    <w:abstractNumId w:val="137"/>
   </w:num>
   <w:num w:numId="102" w16cid:durableId="1515802033">
-    <w:abstractNumId w:val="100"/>
+    <w:abstractNumId w:val="103"/>
   </w:num>
   <w:num w:numId="103" w16cid:durableId="1335262094">
-    <w:abstractNumId w:val="168"/>
+    <w:abstractNumId w:val="173"/>
   </w:num>
   <w:num w:numId="104" w16cid:durableId="216666700">
-    <w:abstractNumId w:val="128"/>
+    <w:abstractNumId w:val="131"/>
   </w:num>
   <w:num w:numId="105" w16cid:durableId="109128233">
-    <w:abstractNumId w:val="36"/>
+    <w:abstractNumId w:val="37"/>
   </w:num>
   <w:num w:numId="106" w16cid:durableId="740295251">
     <w:abstractNumId w:val="6"/>
   </w:num>
   <w:num w:numId="107" w16cid:durableId="381170654">
-    <w:abstractNumId w:val="78"/>
+    <w:abstractNumId w:val="81"/>
   </w:num>
   <w:num w:numId="108" w16cid:durableId="1078795820">
+    <w:abstractNumId w:val="30"/>
+  </w:num>
+  <w:num w:numId="109" w16cid:durableId="565186218">
+    <w:abstractNumId w:val="63"/>
+  </w:num>
+  <w:num w:numId="110" w16cid:durableId="954218831">
+    <w:abstractNumId w:val="118"/>
+  </w:num>
+  <w:num w:numId="111" w16cid:durableId="904101517">
+    <w:abstractNumId w:val="134"/>
+  </w:num>
+  <w:num w:numId="112" w16cid:durableId="1253317046">
+    <w:abstractNumId w:val="92"/>
+  </w:num>
+  <w:num w:numId="113" w16cid:durableId="1813325584">
+    <w:abstractNumId w:val="129"/>
+  </w:num>
+  <w:num w:numId="114" w16cid:durableId="508369199">
+    <w:abstractNumId w:val="152"/>
+  </w:num>
+  <w:num w:numId="115" w16cid:durableId="755593366">
+    <w:abstractNumId w:val="140"/>
+  </w:num>
+  <w:num w:numId="116" w16cid:durableId="526723045">
+    <w:abstractNumId w:val="150"/>
+  </w:num>
+  <w:num w:numId="117" w16cid:durableId="1515725074">
+    <w:abstractNumId w:val="65"/>
+  </w:num>
+  <w:num w:numId="118" w16cid:durableId="1472013178">
+    <w:abstractNumId w:val="155"/>
+  </w:num>
+  <w:num w:numId="119" w16cid:durableId="348145094">
+    <w:abstractNumId w:val="172"/>
+  </w:num>
+  <w:num w:numId="120" w16cid:durableId="1487549432">
     <w:abstractNumId w:val="29"/>
   </w:num>
-  <w:num w:numId="109" w16cid:durableId="565186218">
-    <w:abstractNumId w:val="60"/>
-  </w:num>
-  <w:num w:numId="110" w16cid:durableId="954218831">
-    <w:abstractNumId w:val="115"/>
-  </w:num>
-  <w:num w:numId="111" w16cid:durableId="904101517">
-    <w:abstractNumId w:val="131"/>
-  </w:num>
-  <w:num w:numId="112" w16cid:durableId="1253317046">
-    <w:abstractNumId w:val="89"/>
-  </w:num>
-  <w:num w:numId="113" w16cid:durableId="1813325584">
-    <w:abstractNumId w:val="126"/>
-  </w:num>
-  <w:num w:numId="114" w16cid:durableId="508369199">
-    <w:abstractNumId w:val="149"/>
-  </w:num>
-  <w:num w:numId="115" w16cid:durableId="755593366">
-    <w:abstractNumId w:val="137"/>
-  </w:num>
-  <w:num w:numId="116" w16cid:durableId="526723045">
-    <w:abstractNumId w:val="147"/>
-  </w:num>
-  <w:num w:numId="117" w16cid:durableId="1515725074">
-    <w:abstractNumId w:val="62"/>
-  </w:num>
-  <w:num w:numId="118" w16cid:durableId="1472013178">
-    <w:abstractNumId w:val="152"/>
-  </w:num>
-  <w:num w:numId="119" w16cid:durableId="348145094">
-    <w:abstractNumId w:val="167"/>
-  </w:num>
-  <w:num w:numId="120" w16cid:durableId="1487549432">
-    <w:abstractNumId w:val="28"/>
-  </w:num>
   <w:num w:numId="121" w16cid:durableId="781846308">
-    <w:abstractNumId w:val="170"/>
+    <w:abstractNumId w:val="175"/>
   </w:num>
   <w:num w:numId="122" w16cid:durableId="1928462526">
-    <w:abstractNumId w:val="32"/>
+    <w:abstractNumId w:val="33"/>
   </w:num>
   <w:num w:numId="123" w16cid:durableId="1705324109">
-    <w:abstractNumId w:val="95"/>
+    <w:abstractNumId w:val="98"/>
   </w:num>
   <w:num w:numId="124" w16cid:durableId="937831234">
     <w:abstractNumId w:val="23"/>
@@ -27360,100 +29375,100 @@
     </w:lvlOverride>
   </w:num>
   <w:num w:numId="127" w16cid:durableId="449935055">
-    <w:abstractNumId w:val="68"/>
+    <w:abstractNumId w:val="71"/>
   </w:num>
   <w:num w:numId="128" w16cid:durableId="1261794205">
-    <w:abstractNumId w:val="69"/>
+    <w:abstractNumId w:val="72"/>
   </w:num>
   <w:num w:numId="129" w16cid:durableId="155000773">
-    <w:abstractNumId w:val="50"/>
+    <w:abstractNumId w:val="52"/>
   </w:num>
   <w:num w:numId="130" w16cid:durableId="2068452592">
     <w:abstractNumId w:val="13"/>
   </w:num>
   <w:num w:numId="131" w16cid:durableId="305207024">
-    <w:abstractNumId w:val="180"/>
+    <w:abstractNumId w:val="186"/>
   </w:num>
   <w:num w:numId="132" w16cid:durableId="303120880">
-    <w:abstractNumId w:val="53"/>
+    <w:abstractNumId w:val="55"/>
   </w:num>
   <w:num w:numId="133" w16cid:durableId="926383284">
-    <w:abstractNumId w:val="151"/>
+    <w:abstractNumId w:val="154"/>
   </w:num>
   <w:num w:numId="134" w16cid:durableId="1977298208">
-    <w:abstractNumId w:val="108"/>
+    <w:abstractNumId w:val="111"/>
   </w:num>
   <w:num w:numId="135" w16cid:durableId="1556696686">
-    <w:abstractNumId w:val="116"/>
+    <w:abstractNumId w:val="119"/>
   </w:num>
   <w:num w:numId="136" w16cid:durableId="11954707">
     <w:abstractNumId w:val="11"/>
   </w:num>
   <w:num w:numId="137" w16cid:durableId="1361591553">
-    <w:abstractNumId w:val="41"/>
+    <w:abstractNumId w:val="43"/>
   </w:num>
   <w:num w:numId="138" w16cid:durableId="820736359">
-    <w:abstractNumId w:val="87"/>
+    <w:abstractNumId w:val="90"/>
   </w:num>
   <w:num w:numId="139" w16cid:durableId="1501693897">
-    <w:abstractNumId w:val="122"/>
+    <w:abstractNumId w:val="125"/>
   </w:num>
   <w:num w:numId="140" w16cid:durableId="917518012">
-    <w:abstractNumId w:val="139"/>
+    <w:abstractNumId w:val="142"/>
   </w:num>
   <w:num w:numId="141" w16cid:durableId="1124225954">
-    <w:abstractNumId w:val="178"/>
+    <w:abstractNumId w:val="184"/>
   </w:num>
   <w:num w:numId="142" w16cid:durableId="1428883756">
-    <w:abstractNumId w:val="145"/>
+    <w:abstractNumId w:val="148"/>
   </w:num>
   <w:num w:numId="143" w16cid:durableId="1651326372">
-    <w:abstractNumId w:val="45"/>
+    <w:abstractNumId w:val="47"/>
   </w:num>
   <w:num w:numId="144" w16cid:durableId="1947736491">
     <w:abstractNumId w:val="18"/>
   </w:num>
   <w:num w:numId="145" w16cid:durableId="592209289">
-    <w:abstractNumId w:val="155"/>
+    <w:abstractNumId w:val="160"/>
   </w:num>
   <w:num w:numId="146" w16cid:durableId="397285438">
-    <w:abstractNumId w:val="55"/>
+    <w:abstractNumId w:val="58"/>
   </w:num>
   <w:num w:numId="147" w16cid:durableId="81950788">
-    <w:abstractNumId w:val="104"/>
+    <w:abstractNumId w:val="107"/>
   </w:num>
   <w:num w:numId="148" w16cid:durableId="1868786268">
     <w:abstractNumId w:val="3"/>
   </w:num>
   <w:num w:numId="149" w16cid:durableId="310133827">
-    <w:abstractNumId w:val="25"/>
+    <w:abstractNumId w:val="26"/>
   </w:num>
   <w:num w:numId="150" w16cid:durableId="2057775839">
     <w:abstractNumId w:val="0"/>
   </w:num>
   <w:num w:numId="151" w16cid:durableId="1123428036">
-    <w:abstractNumId w:val="138"/>
+    <w:abstractNumId w:val="141"/>
   </w:num>
   <w:num w:numId="152" w16cid:durableId="991253855">
-    <w:abstractNumId w:val="138"/>
+    <w:abstractNumId w:val="141"/>
     <w:lvlOverride w:ilvl="1">
       <w:startOverride w:val="1"/>
     </w:lvlOverride>
   </w:num>
   <w:num w:numId="153" w16cid:durableId="1024358816">
-    <w:abstractNumId w:val="73"/>
+    <w:abstractNumId w:val="76"/>
   </w:num>
   <w:num w:numId="154" w16cid:durableId="148643133">
-    <w:abstractNumId w:val="82"/>
+    <w:abstractNumId w:val="85"/>
   </w:num>
   <w:num w:numId="155" w16cid:durableId="292488364">
-    <w:abstractNumId w:val="143"/>
+    <w:abstractNumId w:val="146"/>
   </w:num>
   <w:num w:numId="156" w16cid:durableId="1886066264">
-    <w:abstractNumId w:val="148"/>
+    <w:abstractNumId w:val="151"/>
   </w:num>
   <w:num w:numId="157" w16cid:durableId="2038193403">
-    <w:abstractNumId w:val="148"/>
+    <w:abstractNumId w:val="151"/>
     <w:lvlOverride w:ilvl="1">
       <w:lvl w:ilvl="1">
         <w:numFmt w:val="bullet"/>
@@ -27473,19 +29488,19 @@
     </w:lvlOverride>
   </w:num>
   <w:num w:numId="158" w16cid:durableId="1968900077">
-    <w:abstractNumId w:val="26"/>
+    <w:abstractNumId w:val="27"/>
   </w:num>
   <w:num w:numId="159" w16cid:durableId="915242249">
-    <w:abstractNumId w:val="103"/>
+    <w:abstractNumId w:val="106"/>
   </w:num>
   <w:num w:numId="160" w16cid:durableId="2058815222">
     <w:abstractNumId w:val="9"/>
   </w:num>
   <w:num w:numId="161" w16cid:durableId="1672024289">
-    <w:abstractNumId w:val="114"/>
+    <w:abstractNumId w:val="117"/>
   </w:num>
   <w:num w:numId="162" w16cid:durableId="968634561">
-    <w:abstractNumId w:val="114"/>
+    <w:abstractNumId w:val="117"/>
     <w:lvlOverride w:ilvl="1">
       <w:lvl w:ilvl="1">
         <w:numFmt w:val="bullet"/>
@@ -27505,100 +29520,100 @@
     </w:lvlOverride>
   </w:num>
   <w:num w:numId="163" w16cid:durableId="1653365320">
-    <w:abstractNumId w:val="38"/>
+    <w:abstractNumId w:val="39"/>
   </w:num>
   <w:num w:numId="164" w16cid:durableId="346951097">
-    <w:abstractNumId w:val="123"/>
+    <w:abstractNumId w:val="126"/>
   </w:num>
   <w:num w:numId="165" w16cid:durableId="786855938">
-    <w:abstractNumId w:val="46"/>
+    <w:abstractNumId w:val="48"/>
   </w:num>
   <w:num w:numId="166" w16cid:durableId="740370708">
-    <w:abstractNumId w:val="83"/>
+    <w:abstractNumId w:val="86"/>
   </w:num>
   <w:num w:numId="167" w16cid:durableId="1880626334">
-    <w:abstractNumId w:val="83"/>
+    <w:abstractNumId w:val="86"/>
     <w:lvlOverride w:ilvl="2">
       <w:startOverride w:val="1"/>
     </w:lvlOverride>
   </w:num>
   <w:num w:numId="168" w16cid:durableId="1984188479">
-    <w:abstractNumId w:val="56"/>
+    <w:abstractNumId w:val="59"/>
   </w:num>
   <w:num w:numId="169" w16cid:durableId="675571960">
-    <w:abstractNumId w:val="97"/>
+    <w:abstractNumId w:val="100"/>
   </w:num>
   <w:num w:numId="170" w16cid:durableId="461383622">
-    <w:abstractNumId w:val="77"/>
+    <w:abstractNumId w:val="80"/>
   </w:num>
   <w:num w:numId="171" w16cid:durableId="762144377">
-    <w:abstractNumId w:val="44"/>
+    <w:abstractNumId w:val="46"/>
   </w:num>
   <w:num w:numId="172" w16cid:durableId="1992832363">
-    <w:abstractNumId w:val="163"/>
+    <w:abstractNumId w:val="168"/>
   </w:num>
   <w:num w:numId="173" w16cid:durableId="26178679">
-    <w:abstractNumId w:val="174"/>
+    <w:abstractNumId w:val="180"/>
   </w:num>
   <w:num w:numId="174" w16cid:durableId="1417248335">
-    <w:abstractNumId w:val="91"/>
+    <w:abstractNumId w:val="94"/>
   </w:num>
   <w:num w:numId="175" w16cid:durableId="1656832287">
     <w:abstractNumId w:val="1"/>
   </w:num>
   <w:num w:numId="176" w16cid:durableId="2070499139">
-    <w:abstractNumId w:val="177"/>
+    <w:abstractNumId w:val="183"/>
   </w:num>
   <w:num w:numId="177" w16cid:durableId="261184774">
-    <w:abstractNumId w:val="166"/>
+    <w:abstractNumId w:val="171"/>
   </w:num>
   <w:num w:numId="178" w16cid:durableId="878474270">
-    <w:abstractNumId w:val="99"/>
+    <w:abstractNumId w:val="102"/>
   </w:num>
   <w:num w:numId="179" w16cid:durableId="327812">
-    <w:abstractNumId w:val="172"/>
+    <w:abstractNumId w:val="178"/>
   </w:num>
   <w:num w:numId="180" w16cid:durableId="658267108">
-    <w:abstractNumId w:val="159"/>
+    <w:abstractNumId w:val="164"/>
   </w:num>
   <w:num w:numId="181" w16cid:durableId="531961681">
-    <w:abstractNumId w:val="176"/>
+    <w:abstractNumId w:val="182"/>
   </w:num>
   <w:num w:numId="182" w16cid:durableId="1252278911">
-    <w:abstractNumId w:val="94"/>
+    <w:abstractNumId w:val="97"/>
   </w:num>
   <w:num w:numId="183" w16cid:durableId="2090232382">
-    <w:abstractNumId w:val="120"/>
+    <w:abstractNumId w:val="123"/>
   </w:num>
   <w:num w:numId="184" w16cid:durableId="1516916589">
     <w:abstractNumId w:val="24"/>
   </w:num>
   <w:num w:numId="185" w16cid:durableId="231501324">
-    <w:abstractNumId w:val="129"/>
+    <w:abstractNumId w:val="132"/>
   </w:num>
   <w:num w:numId="186" w16cid:durableId="345640200">
     <w:abstractNumId w:val="21"/>
   </w:num>
   <w:num w:numId="187" w16cid:durableId="701127508">
-    <w:abstractNumId w:val="30"/>
+    <w:abstractNumId w:val="31"/>
   </w:num>
   <w:num w:numId="188" w16cid:durableId="339359889">
-    <w:abstractNumId w:val="98"/>
+    <w:abstractNumId w:val="101"/>
   </w:num>
   <w:num w:numId="189" w16cid:durableId="1326006316">
-    <w:abstractNumId w:val="125"/>
+    <w:abstractNumId w:val="128"/>
   </w:num>
   <w:num w:numId="190" w16cid:durableId="454174172">
     <w:abstractNumId w:val="20"/>
   </w:num>
   <w:num w:numId="191" w16cid:durableId="1626932729">
-    <w:abstractNumId w:val="27"/>
+    <w:abstractNumId w:val="28"/>
   </w:num>
   <w:num w:numId="192" w16cid:durableId="831529645">
-    <w:abstractNumId w:val="132"/>
+    <w:abstractNumId w:val="135"/>
   </w:num>
   <w:num w:numId="193" w16cid:durableId="576283714">
-    <w:abstractNumId w:val="162"/>
+    <w:abstractNumId w:val="167"/>
   </w:num>
   <w:num w:numId="194" w16cid:durableId="1222598488">
     <w:abstractNumId w:val="17"/>
@@ -27607,19 +29622,37 @@
     <w:abstractNumId w:val="19"/>
   </w:num>
   <w:num w:numId="196" w16cid:durableId="1320159857">
-    <w:abstractNumId w:val="111"/>
+    <w:abstractNumId w:val="114"/>
   </w:num>
   <w:num w:numId="197" w16cid:durableId="196940243">
-    <w:abstractNumId w:val="71"/>
+    <w:abstractNumId w:val="74"/>
   </w:num>
   <w:num w:numId="198" w16cid:durableId="207571369">
-    <w:abstractNumId w:val="118"/>
+    <w:abstractNumId w:val="121"/>
   </w:num>
   <w:num w:numId="199" w16cid:durableId="1988513581">
-    <w:abstractNumId w:val="47"/>
+    <w:abstractNumId w:val="49"/>
   </w:num>
   <w:num w:numId="200" w16cid:durableId="1150708728">
-    <w:abstractNumId w:val="76"/>
+    <w:abstractNumId w:val="79"/>
+  </w:num>
+  <w:num w:numId="201" w16cid:durableId="1532762413">
+    <w:abstractNumId w:val="40"/>
+  </w:num>
+  <w:num w:numId="202" w16cid:durableId="2064672187">
+    <w:abstractNumId w:val="176"/>
+  </w:num>
+  <w:num w:numId="203" w16cid:durableId="444689681">
+    <w:abstractNumId w:val="25"/>
+  </w:num>
+  <w:num w:numId="204" w16cid:durableId="407699486">
+    <w:abstractNumId w:val="159"/>
+  </w:num>
+  <w:num w:numId="205" w16cid:durableId="2001419470">
+    <w:abstractNumId w:val="57"/>
+  </w:num>
+  <w:num w:numId="206" w16cid:durableId="1273126135">
+    <w:abstractNumId w:val="158"/>
   </w:num>
 </w:numbering>
 </file>

</xml_diff>